<commit_message>
feat: release Agentic AI for HR courseware v6.2
</commit_message>
<xml_diff>
--- a/courseware/LG-Agentic AI for HR.docx
+++ b/courseware/LG-Agentic AI for HR.docx
@@ -40,12 +40,190 @@
         <w:t>Human Resource Digitalisation-4 (HRS-HRM-4031-1.1)</w:t>
         <w:br/>
         <w:br/>
-        <w:t>Version 6.0 • 16 August 2026</w:t>
+        <w:t>Version 6.2 • 16 August 2026</w:t>
       </w:r>
     </w:p>
     <w:p>
       <w:r>
         <w:br w:type="page"/>
+      </w:r>
+    </w:p>
+    <w:p>
+      <w:pPr>
+        <w:pStyle w:val="Heading1"/>
+      </w:pPr>
+      <w:r>
+        <w:t>Document Version Control</w:t>
+      </w:r>
+    </w:p>
+    <w:tbl>
+      <w:tblPr>
+        <w:tblStyle w:val="TableGrid"/>
+        <w:tblW w:type="auto" w:w="0"/>
+        <w:jc w:val="center"/>
+        <w:tblLook w:firstColumn="1" w:firstRow="1" w:lastColumn="0" w:lastRow="0" w:noHBand="0" w:noVBand="1" w:val="04A0"/>
+      </w:tblPr>
+      <w:tblGrid>
+        <w:gridCol w:w="3360"/>
+        <w:gridCol w:w="3360"/>
+        <w:gridCol w:w="3360"/>
+      </w:tblGrid>
+      <w:tr>
+        <w:tc>
+          <w:tcPr>
+            <w:tcW w:type="dxa" w:w="3360"/>
+            <w:shd w:val="clear" w:fill="0C2340"/>
+          </w:tcPr>
+          <w:p>
+            <w:r>
+              <w:rPr>
+                <w:b/>
+                <w:color w:val="FFFFFF"/>
+              </w:rPr>
+              <w:t>Version</w:t>
+            </w:r>
+          </w:p>
+        </w:tc>
+        <w:tc>
+          <w:tcPr>
+            <w:tcW w:type="dxa" w:w="3360"/>
+            <w:shd w:val="clear" w:fill="0C2340"/>
+          </w:tcPr>
+          <w:p>
+            <w:r>
+              <w:rPr>
+                <w:b/>
+                <w:color w:val="FFFFFF"/>
+              </w:rPr>
+              <w:t>Date</w:t>
+            </w:r>
+          </w:p>
+        </w:tc>
+        <w:tc>
+          <w:tcPr>
+            <w:tcW w:type="dxa" w:w="3360"/>
+            <w:shd w:val="clear" w:fill="0C2340"/>
+          </w:tcPr>
+          <w:p>
+            <w:r>
+              <w:rPr>
+                <w:b/>
+                <w:color w:val="FFFFFF"/>
+              </w:rPr>
+              <w:t>Summary</w:t>
+            </w:r>
+          </w:p>
+        </w:tc>
+      </w:tr>
+      <w:tr>
+        <w:tc>
+          <w:tcPr>
+            <w:tcW w:type="dxa" w:w="3360"/>
+            <w:vAlign w:val="center"/>
+          </w:tcPr>
+          <w:p>
+            <w:r>
+              <w:t>6.0</w:t>
+            </w:r>
+          </w:p>
+        </w:tc>
+        <w:tc>
+          <w:tcPr>
+            <w:tcW w:type="dxa" w:w="3360"/>
+            <w:vAlign w:val="center"/>
+          </w:tcPr>
+          <w:p>
+            <w:r>
+              <w:t>16 August 2026</w:t>
+            </w:r>
+          </w:p>
+        </w:tc>
+        <w:tc>
+          <w:tcPr>
+            <w:tcW w:type="dxa" w:w="3360"/>
+            <w:vAlign w:val="center"/>
+          </w:tcPr>
+          <w:p>
+            <w:r>
+              <w:t>Initial redesigned courseware package</w:t>
+            </w:r>
+          </w:p>
+        </w:tc>
+      </w:tr>
+      <w:tr>
+        <w:tc>
+          <w:tcPr>
+            <w:tcW w:type="dxa" w:w="3360"/>
+            <w:vAlign w:val="center"/>
+          </w:tcPr>
+          <w:p>
+            <w:r>
+              <w:t>6.1</w:t>
+            </w:r>
+          </w:p>
+        </w:tc>
+        <w:tc>
+          <w:tcPr>
+            <w:tcW w:type="dxa" w:w="3360"/>
+            <w:vAlign w:val="center"/>
+          </w:tcPr>
+          <w:p>
+            <w:r>
+              <w:t>16 August 2026</w:t>
+            </w:r>
+          </w:p>
+        </w:tc>
+        <w:tc>
+          <w:tcPr>
+            <w:tcW w:type="dxa" w:w="3360"/>
+            <w:vAlign w:val="center"/>
+          </w:tcPr>
+          <w:p>
+            <w:r>
+              <w:t>SPC-aligned administration pages and visual repairs</w:t>
+            </w:r>
+          </w:p>
+        </w:tc>
+      </w:tr>
+      <w:tr>
+        <w:tc>
+          <w:tcPr>
+            <w:tcW w:type="dxa" w:w="3360"/>
+            <w:vAlign w:val="center"/>
+          </w:tcPr>
+          <w:p>
+            <w:r>
+              <w:t>6.2</w:t>
+            </w:r>
+          </w:p>
+        </w:tc>
+        <w:tc>
+          <w:tcPr>
+            <w:tcW w:type="dxa" w:w="3360"/>
+            <w:vAlign w:val="center"/>
+          </w:tcPr>
+          <w:p>
+            <w:r>
+              <w:t>16 August 2026</w:t>
+            </w:r>
+          </w:p>
+        </w:tc>
+        <w:tc>
+          <w:tcPr>
+            <w:tcW w:type="dxa" w:w="3360"/>
+            <w:vAlign w:val="center"/>
+          </w:tcPr>
+          <w:p>
+            <w:r>
+              <w:t>Expanded research, full HR lifecycle activities, mock data and learner PDFs</w:t>
+            </w:r>
+          </w:p>
+        </w:tc>
+      </w:tr>
+    </w:tbl>
+    <w:p>
+      <w:r>
+        <w:t>Version numbers apply to this generated courseware release; assessment instruments retain their separately controlled version.</w:t>
       </w:r>
     </w:p>
     <w:p>
@@ -271,6 +449,184 @@
       </w:pPr>
       <w:r>
         <w:t>LO4. Apply legal, ethical, privacy, security, fairness and human-oversight controls to AI-enabled HR work.</w:t>
+      </w:r>
+    </w:p>
+    <w:p>
+      <w:pPr>
+        <w:pStyle w:val="Heading1"/>
+      </w:pPr>
+      <w:r>
+        <w:t>The course message</w:t>
+      </w:r>
+    </w:p>
+    <w:tbl>
+      <w:tblPr>
+        <w:tblStyle w:val="TableGrid"/>
+        <w:tblW w:type="auto" w:w="0"/>
+        <w:jc w:val="center"/>
+        <w:tblLook w:firstColumn="1" w:firstRow="1" w:lastColumn="0" w:lastRow="0" w:noHBand="0" w:noVBand="1" w:val="04A0"/>
+      </w:tblPr>
+      <w:tblGrid>
+        <w:gridCol w:w="3360"/>
+        <w:gridCol w:w="3360"/>
+        <w:gridCol w:w="3360"/>
+      </w:tblGrid>
+      <w:tr>
+        <w:tc>
+          <w:tcPr>
+            <w:tcW w:type="dxa" w:w="3360"/>
+            <w:shd w:val="clear" w:fill="0C2340"/>
+          </w:tcPr>
+          <w:p>
+            <w:r>
+              <w:rPr>
+                <w:b/>
+                <w:color w:val="FFFFFF"/>
+              </w:rPr>
+              <w:t>Use AI to</w:t>
+            </w:r>
+          </w:p>
+        </w:tc>
+        <w:tc>
+          <w:tcPr>
+            <w:tcW w:type="dxa" w:w="3360"/>
+            <w:shd w:val="clear" w:fill="0C2340"/>
+          </w:tcPr>
+          <w:p>
+            <w:r>
+              <w:rPr>
+                <w:b/>
+                <w:color w:val="FFFFFF"/>
+              </w:rPr>
+              <w:t>Operational effect</w:t>
+            </w:r>
+          </w:p>
+        </w:tc>
+        <w:tc>
+          <w:tcPr>
+            <w:tcW w:type="dxa" w:w="3360"/>
+            <w:shd w:val="clear" w:fill="0C2340"/>
+          </w:tcPr>
+          <w:p>
+            <w:r>
+              <w:rPr>
+                <w:b/>
+                <w:color w:val="FFFFFF"/>
+              </w:rPr>
+              <w:t>Value released</w:t>
+            </w:r>
+          </w:p>
+        </w:tc>
+      </w:tr>
+      <w:tr>
+        <w:tc>
+          <w:tcPr>
+            <w:tcW w:type="dxa" w:w="3360"/>
+            <w:vAlign w:val="center"/>
+          </w:tcPr>
+          <w:p>
+            <w:r>
+              <w:t>Reduce administrative work</w:t>
+            </w:r>
+          </w:p>
+        </w:tc>
+        <w:tc>
+          <w:tcPr>
+            <w:tcW w:type="dxa" w:w="3360"/>
+            <w:vAlign w:val="center"/>
+          </w:tcPr>
+          <w:p>
+            <w:r>
+              <w:t>Automate repetitive search, drafting, rekeying, routing, reminders and status updates</w:t>
+            </w:r>
+          </w:p>
+        </w:tc>
+        <w:tc>
+          <w:tcPr>
+            <w:tcW w:type="dxa" w:w="3360"/>
+            <w:vAlign w:val="center"/>
+          </w:tcPr>
+          <w:p>
+            <w:r>
+              <w:t>More time for complex employee needs</w:t>
+            </w:r>
+          </w:p>
+        </w:tc>
+      </w:tr>
+      <w:tr>
+        <w:tc>
+          <w:tcPr>
+            <w:tcW w:type="dxa" w:w="3360"/>
+            <w:vAlign w:val="center"/>
+          </w:tcPr>
+          <w:p>
+            <w:r>
+              <w:t>Improve productivity and efficiency</w:t>
+            </w:r>
+          </w:p>
+        </w:tc>
+        <w:tc>
+          <w:tcPr>
+            <w:tcW w:type="dxa" w:w="3360"/>
+            <w:vAlign w:val="center"/>
+          </w:tcPr>
+          <w:p>
+            <w:r>
+              <w:t>Shorten cycle time while improving consistency, traceability and service access</w:t>
+            </w:r>
+          </w:p>
+        </w:tc>
+        <w:tc>
+          <w:tcPr>
+            <w:tcW w:type="dxa" w:w="3360"/>
+            <w:vAlign w:val="center"/>
+          </w:tcPr>
+          <w:p>
+            <w:r>
+              <w:t>More reliable HR delivery at scale</w:t>
+            </w:r>
+          </w:p>
+        </w:tc>
+      </w:tr>
+      <w:tr>
+        <w:tc>
+          <w:tcPr>
+            <w:tcW w:type="dxa" w:w="3360"/>
+            <w:vAlign w:val="center"/>
+          </w:tcPr>
+          <w:p>
+            <w:r>
+              <w:t>Focus HR on strategic value</w:t>
+            </w:r>
+          </w:p>
+        </w:tc>
+        <w:tc>
+          <w:tcPr>
+            <w:tcW w:type="dxa" w:w="3360"/>
+            <w:vAlign w:val="center"/>
+          </w:tcPr>
+          <w:p>
+            <w:r>
+              <w:t>Return capacity to workforce planning, coaching, culture, organisation design and employee care</w:t>
+            </w:r>
+          </w:p>
+        </w:tc>
+        <w:tc>
+          <w:tcPr>
+            <w:tcW w:type="dxa" w:w="3360"/>
+            <w:vAlign w:val="center"/>
+          </w:tcPr>
+          <w:p>
+            <w:r>
+              <w:t>A stronger connection between the people agenda and business outcomes</w:t>
+            </w:r>
+          </w:p>
+        </w:tc>
+      </w:tr>
+    </w:tbl>
+    <w:p>
+      <w:r>
+        <w:t>The objective is not to remove human accountability. Copilot accelerates knowledge work; bounded agents coordinate approved work; authorised HR professionals remain responsible for consequential decisions and human conversations.</w:t>
       </w:r>
     </w:p>
     <w:p>
@@ -451,6 +807,76 @@
         <w:pStyle w:val="Heading1"/>
       </w:pPr>
       <w:r>
+        <w:t>Reference case vignettes</w:t>
+      </w:r>
+    </w:p>
+    <w:p>
+      <w:r>
+        <w:t>The user-supplied ebook presents four unnamed implementation vignettes. They are included as secondary-source discussion cases; the reported organisations are not independently identified in the reference.</w:t>
+      </w:r>
+    </w:p>
+    <w:p>
+      <w:pPr>
+        <w:pStyle w:val="Heading2"/>
+      </w:pPr>
+      <w:r>
+        <w:t>Technology — recruitment</w:t>
+      </w:r>
+    </w:p>
+    <w:p>
+      <w:r>
+        <w:t>AI-assisted screening and candidate chat reportedly shortened the hiring cycle by 30% while supporting diversity-oriented process improvements.</w:t>
+      </w:r>
+    </w:p>
+    <w:p>
+      <w:pPr>
+        <w:pStyle w:val="Heading2"/>
+      </w:pPr>
+      <w:r>
+        <w:t>Retail — engagement and retention</w:t>
+      </w:r>
+    </w:p>
+    <w:p>
+      <w:r>
+        <w:t>Feedback and sentiment analysis informed targeted interventions associated with a reported 20% reduction in turnover.</w:t>
+      </w:r>
+    </w:p>
+    <w:p>
+      <w:pPr>
+        <w:pStyle w:val="Heading2"/>
+      </w:pPr>
+      <w:r>
+        <w:t>Financial services — talent development</w:t>
+      </w:r>
+    </w:p>
+    <w:p>
+      <w:r>
+        <w:t>Predictive talent evidence supported succession planning, leadership-pipeline decisions and personalised development.</w:t>
+      </w:r>
+    </w:p>
+    <w:p>
+      <w:pPr>
+        <w:pStyle w:val="Heading2"/>
+      </w:pPr>
+      <w:r>
+        <w:t>Healthcare — performance and coaching</w:t>
+      </w:r>
+    </w:p>
+    <w:p>
+      <w:r>
+        <w:t>More timely performance evidence enabled earlier coaching and more consistent reviews.</w:t>
+      </w:r>
+    </w:p>
+    <w:p>
+      <w:r>
+        <w:t>Discussion: What administrative work was reduced? What evidence suggests productivity or service improvement? Which strategic HR activity became more possible? What safeguards and verification would be required before applying the pattern?</w:t>
+      </w:r>
+    </w:p>
+    <w:p>
+      <w:pPr>
+        <w:pStyle w:val="Heading1"/>
+      </w:pPr>
+      <w:r>
         <w:t>Contents and slide alignment</w:t>
       </w:r>
     </w:p>
@@ -543,7 +969,7 @@
           </w:tcPr>
           <w:p>
             <w:r>
-              <w:t>17–36</w:t>
+              <w:t>17–42</w:t>
             </w:r>
           </w:p>
         </w:tc>
@@ -578,7 +1004,7 @@
           </w:tcPr>
           <w:p>
             <w:r>
-              <w:t>37–56</w:t>
+              <w:t>43–64</w:t>
             </w:r>
           </w:p>
         </w:tc>
@@ -613,7 +1039,7 @@
           </w:tcPr>
           <w:p>
             <w:r>
-              <w:t>57–76</w:t>
+              <w:t>65–85</w:t>
             </w:r>
           </w:p>
         </w:tc>
@@ -648,7 +1074,7 @@
           </w:tcPr>
           <w:p>
             <w:r>
-              <w:t>77–96</w:t>
+              <w:t>86–109</w:t>
             </w:r>
           </w:p>
         </w:tc>
@@ -685,6 +1111,156 @@
         <w:pStyle w:val="Heading3"/>
       </w:pPr>
       <w:r>
+        <w:t>Today's HR operating pain</w:t>
+      </w:r>
+    </w:p>
+    <w:p>
+      <w:r>
+        <w:t>Fragmented channels and repeated hand-offs trap HR capacity in administration.</w:t>
+      </w:r>
+    </w:p>
+    <w:p>
+      <w:pPr>
+        <w:pStyle w:val="ListBullet"/>
+      </w:pPr>
+      <w:r>
+        <w:t>Requests arrive through email, forms and chat with no shared case view</w:t>
+      </w:r>
+    </w:p>
+    <w:p>
+      <w:pPr>
+        <w:pStyle w:val="ListBullet"/>
+      </w:pPr>
+      <w:r>
+        <w:t>HR rekeys the same data across trackers, documents and systems</w:t>
+      </w:r>
+    </w:p>
+    <w:p>
+      <w:pPr>
+        <w:pStyle w:val="ListBullet"/>
+      </w:pPr>
+      <w:r>
+        <w:t>Employees and managers wait for inconsistent answers and approvals</w:t>
+      </w:r>
+    </w:p>
+    <w:p>
+      <w:pPr>
+        <w:pStyle w:val="ListBullet"/>
+      </w:pPr>
+      <w:r>
+        <w:t>Evidence, ownership and exceptions are difficult to trace</w:t>
+      </w:r>
+    </w:p>
+    <w:p>
+      <w:r>
+        <w:t>Sources: https://www.ibm.com/think/topics/ai-in-hr; https://www.zendesk.com/blog/ai/workflow-automation/ai-in-hr/; AI Revolution in Human Resources: Transforming HR Management with Artificial Intelligence (2023 user-supplied ebook)</w:t>
+      </w:r>
+    </w:p>
+    <w:p>
+      <w:pPr>
+        <w:pStyle w:val="Heading3"/>
+      </w:pPr>
+      <w:r>
+        <w:t>The strategic case for HR AI</w:t>
+      </w:r>
+    </w:p>
+    <w:p>
+      <w:r>
+        <w:t>Automate routine work so HR can deliver faster service and more strategic value.</w:t>
+      </w:r>
+    </w:p>
+    <w:p>
+      <w:pPr>
+        <w:pStyle w:val="ListBullet"/>
+      </w:pPr>
+      <w:r>
+        <w:t>Reduce administrative work and avoidable rekeying</w:t>
+      </w:r>
+    </w:p>
+    <w:p>
+      <w:pPr>
+        <w:pStyle w:val="ListBullet"/>
+      </w:pPr>
+      <w:r>
+        <w:t>Improve productivity, efficiency and response consistency</w:t>
+      </w:r>
+    </w:p>
+    <w:p>
+      <w:pPr>
+        <w:pStyle w:val="ListBullet"/>
+      </w:pPr>
+      <w:r>
+        <w:t>Return capacity to workforce strategy, coaching and employee care</w:t>
+      </w:r>
+    </w:p>
+    <w:p>
+      <w:pPr>
+        <w:pStyle w:val="ListBullet"/>
+      </w:pPr>
+      <w:r>
+        <w:t>Use human-AI partnerships to connect the people agenda to business outcomes</w:t>
+      </w:r>
+    </w:p>
+    <w:p>
+      <w:r>
+        <w:t>Sources: Deloitte, The Future of HR, Powered by AI (user-supplied reference deck); https://www.mckinsey.com/capabilities/people-and-organizational-performance/our-insights/the-organization-blog/four-ways-to-start-using-generative-ai-in-hr</w:t>
+      </w:r>
+    </w:p>
+    <w:p>
+      <w:pPr>
+        <w:pStyle w:val="Heading3"/>
+      </w:pPr>
+      <w:r>
+        <w:t>Why now: the people and AI agendas converge</w:t>
+      </w:r>
+    </w:p>
+    <w:p>
+      <w:r>
+        <w:t>HR must build internal capability while helping the enterprise navigate AI disruption.</w:t>
+      </w:r>
+    </w:p>
+    <w:p>
+      <w:pPr>
+        <w:pStyle w:val="ListBullet"/>
+      </w:pPr>
+      <w:r>
+        <w:t>79% of surveyed leaders expected GenAI to substantially transform their organisation or industry</w:t>
+      </w:r>
+    </w:p>
+    <w:p>
+      <w:pPr>
+        <w:pStyle w:val="ListBullet"/>
+      </w:pPr>
+      <w:r>
+        <w:t>72% expected GenAI to change talent strategies</w:t>
+      </w:r>
+    </w:p>
+    <w:p>
+      <w:pPr>
+        <w:pStyle w:val="ListBullet"/>
+      </w:pPr>
+      <w:r>
+        <w:t>Only 23% reported GenAI investment in HR in the cited study</w:t>
+      </w:r>
+    </w:p>
+    <w:p>
+      <w:pPr>
+        <w:pStyle w:val="ListBullet"/>
+      </w:pPr>
+      <w:r>
+        <w:t>81% said business and people agendas had never been more intertwined</w:t>
+      </w:r>
+    </w:p>
+    <w:p>
+      <w:r>
+        <w:t>Sources: Deloitte, The Future of HR, Powered by AI (user-supplied reference deck)</w:t>
+      </w:r>
+    </w:p>
+    <w:p>
+      <w:pPr>
+        <w:pStyle w:val="Heading3"/>
+      </w:pPr>
+      <w:r>
         <w:t>The HR AI continuum</w:t>
       </w:r>
     </w:p>
@@ -735,6 +1311,106 @@
         <w:pStyle w:val="Heading3"/>
       </w:pPr>
       <w:r>
+        <w:t>Four shifts in HR work</w:t>
+      </w:r>
+    </w:p>
+    <w:p>
+      <w:r>
+        <w:t>AI value moves from efficiency to new human and enterprise value.</w:t>
+      </w:r>
+    </w:p>
+    <w:p>
+      <w:pPr>
+        <w:pStyle w:val="ListBullet"/>
+      </w:pPr>
+      <w:r>
+        <w:t>Automate: eliminate repetitive work about work</w:t>
+      </w:r>
+    </w:p>
+    <w:p>
+      <w:pPr>
+        <w:pStyle w:val="ListBullet"/>
+      </w:pPr>
+      <w:r>
+        <w:t>Augment: support people to improve productivity and experience</w:t>
+      </w:r>
+    </w:p>
+    <w:p>
+      <w:pPr>
+        <w:pStyle w:val="ListBullet"/>
+      </w:pPr>
+      <w:r>
+        <w:t>Extend: analyse and personalise at a scale humans cannot</w:t>
+      </w:r>
+    </w:p>
+    <w:p>
+      <w:pPr>
+        <w:pStyle w:val="ListBullet"/>
+      </w:pPr>
+      <w:r>
+        <w:t>Create: design, test and operate new AI-enabled HR services</w:t>
+      </w:r>
+    </w:p>
+    <w:p>
+      <w:r>
+        <w:t>Sources: Deloitte, The Future of HR, Powered by AI (user-supplied reference deck)</w:t>
+      </w:r>
+    </w:p>
+    <w:p>
+      <w:pPr>
+        <w:pStyle w:val="Heading3"/>
+      </w:pPr>
+      <w:r>
+        <w:t>HR's own AI evolution</w:t>
+      </w:r>
+    </w:p>
+    <w:p>
+      <w:r>
+        <w:t>HR moves incrementally from AI-assisted to AI-augmented and AI-powered work.</w:t>
+      </w:r>
+    </w:p>
+    <w:p>
+      <w:pPr>
+        <w:pStyle w:val="ListBullet"/>
+      </w:pPr>
+      <w:r>
+        <w:t>AI-assisted: humans own the work with moderate AI support</w:t>
+      </w:r>
+    </w:p>
+    <w:p>
+      <w:pPr>
+        <w:pStyle w:val="ListBullet"/>
+      </w:pPr>
+      <w:r>
+        <w:t>AI-augmented: people and AI collaborate with frequent hand-offs</w:t>
+      </w:r>
+    </w:p>
+    <w:p>
+      <w:pPr>
+        <w:pStyle w:val="ListBullet"/>
+      </w:pPr>
+      <w:r>
+        <w:t>AI-powered: AI handles bounded work while people monitor and improve</w:t>
+      </w:r>
+    </w:p>
+    <w:p>
+      <w:pPr>
+        <w:pStyle w:val="ListBullet"/>
+      </w:pPr>
+      <w:r>
+        <w:t>Fully autonomous HR remains rare; human accountability endures</w:t>
+      </w:r>
+    </w:p>
+    <w:p>
+      <w:r>
+        <w:t>Sources: Deloitte, The Future of HR, Powered by AI (user-supplied reference deck)</w:t>
+      </w:r>
+    </w:p>
+    <w:p>
+      <w:pPr>
+        <w:pStyle w:val="Heading3"/>
+      </w:pPr>
+      <w:r>
         <w:t>Conventional HR operating model</w:t>
       </w:r>
     </w:p>
@@ -985,6 +1661,56 @@
         <w:pStyle w:val="Heading3"/>
       </w:pPr>
       <w:r>
+        <w:t>AI-powered HR operating model</w:t>
+      </w:r>
+    </w:p>
+    <w:p>
+      <w:r>
+        <w:t>An AI and data core needs strategy, product, engineering, insight and people-operations capabilities around it.</w:t>
+      </w:r>
+    </w:p>
+    <w:p>
+      <w:pPr>
+        <w:pStyle w:val="ListBullet"/>
+      </w:pPr>
+      <w:r>
+        <w:t>HR strategy, governance and portfolio management set value and risk priorities</w:t>
+      </w:r>
+    </w:p>
+    <w:p>
+      <w:pPr>
+        <w:pStyle w:val="ListBullet"/>
+      </w:pPr>
+      <w:r>
+        <w:t>Workforce solution architects and an innovation hub design human-centred services</w:t>
+      </w:r>
+    </w:p>
+    <w:p>
+      <w:pPr>
+        <w:pStyle w:val="ListBullet"/>
+      </w:pPr>
+      <w:r>
+        <w:t>Solution DevOps and sustainment operate agents, integrations and controls</w:t>
+      </w:r>
+    </w:p>
+    <w:p>
+      <w:pPr>
+        <w:pStyle w:val="ListBullet"/>
+      </w:pPr>
+      <w:r>
+        <w:t>People operations and workforce engagement keep employee outcomes visible</w:t>
+      </w:r>
+    </w:p>
+    <w:p>
+      <w:r>
+        <w:t>Sources: Deloitte, The Future of HR, Powered by AI (user-supplied reference deck)</w:t>
+      </w:r>
+    </w:p>
+    <w:p>
+      <w:pPr>
+        <w:pStyle w:val="Heading3"/>
+      </w:pPr>
+      <w:r>
         <w:t>Agent anatomy</w:t>
       </w:r>
     </w:p>
@@ -1290,7 +2016,7 @@
         <w:pStyle w:val="Heading2"/>
       </w:pPr>
       <w:r>
-        <w:t>Activity 1: Map the HR AI Opportunity Portfolio</w:t>
+        <w:t>Activity 1: Assess Talent Needs with Copilot</w:t>
       </w:r>
     </w:p>
     <w:p>
@@ -1303,7 +2029,7 @@
     </w:p>
     <w:p>
       <w:r>
-        <w:t>HarbourLight Logistics SG has 620 employees, a five-person HR team and rising service backlogs. The CHRO wants a defendable starting portfolio—not a list of fashionable tools.</w:t>
+        <w:t>HarbourLight Logistics SG is opening a digitally enabled distribution hub. HR receives demand forecasts, overtime data, vacancy history and a skills inventory in separate files, so workforce decisions are slow and reactive.</w:t>
       </w:r>
     </w:p>
     <w:p>
@@ -1316,7 +2042,7 @@
     </w:p>
     <w:p>
       <w:r>
-        <w:t>Classify HR work across automation, Microsoft 365 Copilot and agentic AI, then select one bounded pilot.</w:t>
+        <w:t>Use Microsoft 365 Copilot to turn operational evidence into a transparent hire, redeploy or develop recommendation.</w:t>
       </w:r>
     </w:p>
     <w:p>
@@ -1329,7 +2055,7 @@
     </w:p>
     <w:p>
       <w:r>
-        <w:t>Microsoft Teams; Microsoft 365 Copilot; Excel</w:t>
+        <w:t>Excel with Microsoft 365 Copilot; Teams</w:t>
       </w:r>
     </w:p>
     <w:p>
@@ -1342,42 +2068,42 @@
     </w:p>
     <w:p>
       <w:r>
-        <w:t>1. Review the synthetic HR demand and pain-point data in the workbook.</w:t>
-      </w:r>
-    </w:p>
-    <w:p>
-      <w:r>
-        <w:t>2. Define the employee or manager outcome for each use case.</w:t>
-      </w:r>
-    </w:p>
-    <w:p>
-      <w:r>
-        <w:t>3. Classify the work as deterministic automation, Copilot-assisted knowledge work, agentic orchestration or unsuitable.</w:t>
-      </w:r>
-    </w:p>
-    <w:p>
-      <w:r>
-        <w:t>4. Score frequency, value, data readiness, reversibility and people risk using the workbook rubric.</w:t>
-      </w:r>
-    </w:p>
-    <w:p>
-      <w:r>
-        <w:t>5. Use Copilot to challenge the top three options and list hidden dependencies.</w:t>
-      </w:r>
-    </w:p>
-    <w:p>
-      <w:r>
-        <w:t>6. Select one pilot and one explicit non-goal.</w:t>
-      </w:r>
-    </w:p>
-    <w:p>
-      <w:r>
-        <w:t>7. Record baseline, success threshold, owner and stop condition.</w:t>
-      </w:r>
-    </w:p>
-    <w:p>
-      <w:r>
-        <w:t>8. Peer-review another team's selection for over-automation or missing stakeholders.</w:t>
+        <w:t>1. Review the synthetic demand, overtime, vacancy and skills-inventory evidence.</w:t>
+      </w:r>
+    </w:p>
+    <w:p>
+      <w:r>
+        <w:t>2. Define the business outcomes and time horizon for the new hub.</w:t>
+      </w:r>
+    </w:p>
+    <w:p>
+      <w:r>
+        <w:t>3. Ask Copilot to summarise demand drivers and cite the supporting cells.</w:t>
+      </w:r>
+    </w:p>
+    <w:p>
+      <w:r>
+        <w:t>4. Compare required capabilities with the current workforce skills inventory.</w:t>
+      </w:r>
+    </w:p>
+    <w:p>
+      <w:r>
+        <w:t>5. Create hire, redeploy, automate and develop options with assumptions and trade-offs.</w:t>
+      </w:r>
+    </w:p>
+    <w:p>
+      <w:r>
+        <w:t>6. Stress-test the preferred option against high- and low-demand scenarios.</w:t>
+      </w:r>
+    </w:p>
+    <w:p>
+      <w:r>
+        <w:t>7. Record the human-approved talent need, success measure and review date.</w:t>
+      </w:r>
+    </w:p>
+    <w:p>
+      <w:r>
+        <w:t>8. Pass the approved role outcomes and skills to Activity 2.</w:t>
       </w:r>
     </w:p>
     <w:p>
@@ -1390,7 +2116,7 @@
     </w:p>
     <w:p>
       <w:r>
-        <w:t>You are supporting the Agentic AI for HR case. Use only the supplied synthetic evidence. Task: Classify HR work across automation, Microsoft 365 Copilot and agentic AI, then select one bounded pilot. State assumptions, cite the evidence used, distinguish observation from inference, identify uncertainty, and list the human checks required before use.</w:t>
+        <w:t>You are supporting the Agentic AI for HR case. Use only the supplied synthetic evidence. Task: Use Microsoft 365 Copilot to turn operational evidence into a transparent hire, redeploy or develop recommendation. State assumptions, cite the evidence used, distinguish observation from inference, identify uncertainty, and list the human checks required before use.</w:t>
       </w:r>
     </w:p>
     <w:p>
@@ -1406,23 +2132,23 @@
         <w:pStyle w:val="ListBullet"/>
       </w:pPr>
       <w:r>
-        <w:t>Completed opportunity-and-risk matrix</w:t>
-      </w:r>
-    </w:p>
-    <w:p>
-      <w:pPr>
-        <w:pStyle w:val="ListBullet"/>
-      </w:pPr>
-      <w:r>
-        <w:t>Two-minute pilot recommendation</w:t>
-      </w:r>
-    </w:p>
-    <w:p>
-      <w:pPr>
-        <w:pStyle w:val="ListBullet"/>
-      </w:pPr>
-      <w:r>
-        <w:t>Evidence log</w:t>
+        <w:t>Talent-demand evidence map</w:t>
+      </w:r>
+    </w:p>
+    <w:p>
+      <w:pPr>
+        <w:pStyle w:val="ListBullet"/>
+      </w:pPr>
+      <w:r>
+        <w:t>Skills-gap analysis</w:t>
+      </w:r>
+    </w:p>
+    <w:p>
+      <w:pPr>
+        <w:pStyle w:val="ListBullet"/>
+      </w:pPr>
+      <w:r>
+        <w:t>Hire-redeploy-develop recommendation</w:t>
       </w:r>
     </w:p>
     <w:p>
@@ -1438,23 +2164,23 @@
         <w:pStyle w:val="ListBullet"/>
       </w:pPr>
       <w:r>
-        <w:t>No employee personal data</w:t>
-      </w:r>
-    </w:p>
-    <w:p>
-      <w:pPr>
-        <w:pStyle w:val="ListBullet"/>
-      </w:pPr>
-      <w:r>
-        <w:t>State all assumptions</w:t>
-      </w:r>
-    </w:p>
-    <w:p>
-      <w:pPr>
-        <w:pStyle w:val="ListBullet"/>
-      </w:pPr>
-      <w:r>
-        <w:t>Human owner for every shortlisted use case</w:t>
+        <w:t>Cite the supplied cells and records</w:t>
+      </w:r>
+    </w:p>
+    <w:p>
+      <w:pPr>
+        <w:pStyle w:val="ListBullet"/>
+      </w:pPr>
+      <w:r>
+        <w:t>Separate fact from forecast</w:t>
+      </w:r>
+    </w:p>
+    <w:p>
+      <w:pPr>
+        <w:pStyle w:val="ListBullet"/>
+      </w:pPr>
+      <w:r>
+        <w:t>Business and HR owners approve the demand hypothesis</w:t>
       </w:r>
     </w:p>
     <w:p>
@@ -1475,7 +2201,7 @@
         <w:pStyle w:val="ListNumber"/>
       </w:pPr>
       <w:r>
-        <w:t>Why is the selected capability the lightest sufficient option?</w:t>
+        <w:t>Which assumption most changes the talent need?</w:t>
       </w:r>
     </w:p>
     <w:p>
@@ -1483,7 +2209,7 @@
         <w:pStyle w:val="ListNumber"/>
       </w:pPr>
       <w:r>
-        <w:t>What evidence would stop the pilot?</w:t>
+        <w:t>Where could automation reduce workload without removing accountability?</w:t>
       </w:r>
     </w:p>
     <w:p>
@@ -1491,7 +2217,7 @@
         <w:pStyle w:val="ListNumber"/>
       </w:pPr>
       <w:r>
-        <w:t>Whose experience could worsen even if cycle time improves?</w:t>
+        <w:t>What evidence would trigger a plan revision?</w:t>
       </w:r>
     </w:p>
     <w:p>
@@ -1504,7 +2230,7 @@
         <w:pStyle w:val="Heading2"/>
       </w:pPr>
       <w:r>
-        <w:t>Activity 2: Design a Skills-Based Workforce Plan</w:t>
+        <w:t>Activity 2: Draft an Inclusive Job Description with Generative AI</w:t>
       </w:r>
     </w:p>
     <w:p>
@@ -1517,7 +2243,7 @@
     </w:p>
     <w:p>
       <w:r>
-        <w:t>HarbourLight is opening a digitally enabled distribution hub. HR must decide whether to hire, redeploy or develop people for a new Workforce Operations Analyst role.</w:t>
+        <w:t>Activity 1 established a need for a Workforce Operations Analyst. The old JD is task-heavy, contains copied requirements and does not reflect the outcomes or skills needed at the new hub.</w:t>
       </w:r>
     </w:p>
     <w:p>
@@ -1530,7 +2256,7 @@
     </w:p>
     <w:p>
       <w:r>
-        <w:t>Use Copilot to synthesise demand evidence and draft a skills-based, fair job design.</w:t>
+        <w:t>Use Word Copilot to draft a skills-based, inclusive and approval-ready job description grounded in the approved talent need.</w:t>
       </w:r>
     </w:p>
     <w:p>
@@ -1543,7 +2269,7 @@
     </w:p>
     <w:p>
       <w:r>
-        <w:t>Excel with Microsoft 365 Copilot; Word with Microsoft 365 Copilot</w:t>
+        <w:t>Word with Microsoft 365 Copilot; Excel</w:t>
       </w:r>
     </w:p>
     <w:p>
@@ -1556,42 +2282,42 @@
     </w:p>
     <w:p>
       <w:r>
-        <w:t>1. Inspect the synthetic demand, workload and skills inventory tabs.</w:t>
-      </w:r>
-    </w:p>
-    <w:p>
-      <w:r>
-        <w:t>2. Ask Copilot to summarise demand drivers and cite the cells used.</w:t>
-      </w:r>
-    </w:p>
-    <w:p>
-      <w:r>
-        <w:t>3. Draft hire, redeploy and develop options with trade-offs.</w:t>
-      </w:r>
-    </w:p>
-    <w:p>
-      <w:r>
-        <w:t>4. Choose a planning hypothesis and mark uncertainty.</w:t>
-      </w:r>
-    </w:p>
-    <w:p>
-      <w:r>
-        <w:t>5. Translate role outcomes into essential and trainable skills.</w:t>
-      </w:r>
-    </w:p>
-    <w:p>
-      <w:r>
-        <w:t>6. Draft a job description in Word grounded in the approved skills table.</w:t>
-      </w:r>
-    </w:p>
-    <w:p>
-      <w:r>
-        <w:t>7. Run an inclusive-language and job-relatedness review.</w:t>
-      </w:r>
-    </w:p>
-    <w:p>
-      <w:r>
-        <w:t>8. Document what the hiring manager must validate.</w:t>
+        <w:t>1. Import the approved role outcomes and skills from Activity 1 or use the supplied fallback brief.</w:t>
+      </w:r>
+    </w:p>
+    <w:p>
+      <w:r>
+        <w:t>2. Identify obsolete, vague or non-job-related requirements in the legacy JD.</w:t>
+      </w:r>
+    </w:p>
+    <w:p>
+      <w:r>
+        <w:t>3. Prompt Copilot to draft purpose, outcomes, responsibilities and success measures.</w:t>
+      </w:r>
+    </w:p>
+    <w:p>
+      <w:r>
+        <w:t>4. Separate essential capabilities from skills that can be developed after hiring.</w:t>
+      </w:r>
+    </w:p>
+    <w:p>
+      <w:r>
+        <w:t>5. Add working conditions, reporting line and realistic candidate information.</w:t>
+      </w:r>
+    </w:p>
+    <w:p>
+      <w:r>
+        <w:t>6. Run inclusive-language, accessibility and fair-consideration checks.</w:t>
+      </w:r>
+    </w:p>
+    <w:p>
+      <w:r>
+        <w:t>7. Ask the hiring manager to validate each criterion and remove unsupported requirements.</w:t>
+      </w:r>
+    </w:p>
+    <w:p>
+      <w:r>
+        <w:t>8. Convert the final JD criteria into the anchored screening rubric for Activity 3.</w:t>
       </w:r>
     </w:p>
     <w:p>
@@ -1604,7 +2330,7 @@
     </w:p>
     <w:p>
       <w:r>
-        <w:t>You are supporting the Agentic AI for HR case. Use only the supplied synthetic evidence. Task: Use Copilot to synthesise demand evidence and draft a skills-based, fair job design. State assumptions, cite the evidence used, distinguish observation from inference, identify uncertainty, and list the human checks required before use.</w:t>
+        <w:t>You are supporting the Agentic AI for HR case. Use only the supplied synthetic evidence. Task: Use Word Copilot to draft a skills-based, inclusive and approval-ready job description grounded in the approved talent need. State assumptions, cite the evidence used, distinguish observation from inference, identify uncertainty, and list the human checks required before use.</w:t>
       </w:r>
     </w:p>
     <w:p>
@@ -1620,15 +2346,7 @@
         <w:pStyle w:val="ListBullet"/>
       </w:pPr>
       <w:r>
-        <w:t>Workforce hypothesis</w:t>
-      </w:r>
-    </w:p>
-    <w:p>
-      <w:pPr>
-        <w:pStyle w:val="ListBullet"/>
-      </w:pPr>
-      <w:r>
-        <w:t>Skills gap table</w:t>
+        <w:t>Role-outcome map</w:t>
       </w:r>
     </w:p>
     <w:p>
@@ -1641,6 +2359,14 @@
     </w:p>
     <w:p>
       <w:pPr>
+        <w:pStyle w:val="ListBullet"/>
+      </w:pPr>
+      <w:r>
+        <w:t>Hiring-manager validation checklist</w:t>
+      </w:r>
+    </w:p>
+    <w:p>
+      <w:pPr>
         <w:pStyle w:val="Heading3"/>
       </w:pPr>
       <w:r>
@@ -1652,23 +2378,23 @@
         <w:pStyle w:val="ListBullet"/>
       </w:pPr>
       <w:r>
-        <w:t>Separate evidence from assumption</w:t>
-      </w:r>
-    </w:p>
-    <w:p>
-      <w:pPr>
-        <w:pStyle w:val="ListBullet"/>
-      </w:pPr>
-      <w:r>
-        <w:t>No age, nationality or other non-job-related criteria</w:t>
-      </w:r>
-    </w:p>
-    <w:p>
-      <w:pPr>
-        <w:pStyle w:val="ListBullet"/>
-      </w:pPr>
-      <w:r>
-        <w:t>Hiring manager approval</w:t>
+        <w:t>Use job-related criteria only</w:t>
+      </w:r>
+    </w:p>
+    <w:p>
+      <w:pPr>
+        <w:pStyle w:val="ListBullet"/>
+      </w:pPr>
+      <w:r>
+        <w:t>Distinguish essential from trainable skills</w:t>
+      </w:r>
+    </w:p>
+    <w:p>
+      <w:pPr>
+        <w:pStyle w:val="ListBullet"/>
+      </w:pPr>
+      <w:r>
+        <w:t>Hiring manager and HR approve every requirement</w:t>
       </w:r>
     </w:p>
     <w:p>
@@ -1689,7 +2415,7 @@
         <w:pStyle w:val="ListNumber"/>
       </w:pPr>
       <w:r>
-        <w:t>Which assumption has the greatest planning impact?</w:t>
+        <w:t>Which copied requirement would unnecessarily narrow the talent pool?</w:t>
       </w:r>
     </w:p>
     <w:p>
@@ -1697,7 +2423,7 @@
         <w:pStyle w:val="ListNumber"/>
       </w:pPr>
       <w:r>
-        <w:t>Which requirement could unfairly narrow the pool?</w:t>
+        <w:t>What must the hiring manager verify rather than delegate to Copilot?</w:t>
       </w:r>
     </w:p>
     <w:p>
@@ -1705,7 +2431,7 @@
         <w:pStyle w:val="ListNumber"/>
       </w:pPr>
       <w:r>
-        <w:t>How will the hypothesis be revisited?</w:t>
+        <w:t>How does the JD make later screening contestable?</w:t>
       </w:r>
     </w:p>
     <w:p>
@@ -1718,7 +2444,7 @@
         <w:pStyle w:val="Heading2"/>
       </w:pPr>
       <w:r>
-        <w:t>Activity 3: Write the Governed HR AI Pilot Charter</w:t>
+        <w:t>Activity 3: Screen Resumes with a Fair Evidence Matrix</w:t>
       </w:r>
     </w:p>
     <w:p>
@@ -1731,7 +2457,7 @@
     </w:p>
     <w:p>
       <w:r>
-        <w:t>The executive committee will fund only one 90-day HR AI pilot. It expects a clear value case, human controls and an operating owner.</w:t>
+        <w:t>Six synthetic candidates apply for the Workforce Operations Analyst role from Activity 2. Recruiters currently scan resumes inconsistently and retype evidence into spreadsheets.</w:t>
       </w:r>
     </w:p>
     <w:p>
@@ -1744,7 +2470,7 @@
     </w:p>
     <w:p>
       <w:r>
-        <w:t>Convert an opportunity into a testable pilot charter with go/no-go gates.</w:t>
+        <w:t>Use Microsoft 365 Copilot to extract job-related evidence at speed while keeping shortlist decisions human, traceable and reviewable.</w:t>
       </w:r>
     </w:p>
     <w:p>
@@ -1757,7 +2483,7 @@
     </w:p>
     <w:p>
       <w:r>
-        <w:t>Word with Microsoft 365 Copilot; Excel</w:t>
+        <w:t>Excel with Microsoft 365 Copilot; Word</w:t>
       </w:r>
     </w:p>
     <w:p>
@@ -1770,42 +2496,42 @@
     </w:p>
     <w:p>
       <w:r>
-        <w:t>1. Select the use case approved in Activity 1 or use the provided leave-agent case.</w:t>
-      </w:r>
-    </w:p>
-    <w:p>
-      <w:r>
-        <w:t>2. Define the user, outcome, trigger, boundary and non-goals.</w:t>
-      </w:r>
-    </w:p>
-    <w:p>
-      <w:r>
-        <w:t>3. Map data, knowledge, tools, decisions and human approvals.</w:t>
-      </w:r>
-    </w:p>
-    <w:p>
-      <w:r>
-        <w:t>4. Ask Copilot to draft a charter from the workbook evidence.</w:t>
-      </w:r>
-    </w:p>
-    <w:p>
-      <w:r>
-        <w:t>5. Add baseline, target, guardrail and stop metrics.</w:t>
-      </w:r>
-    </w:p>
-    <w:p>
-      <w:r>
-        <w:t>6. Assign business owner, technical owner, policy owner, approver and support roles.</w:t>
-      </w:r>
-    </w:p>
-    <w:p>
-      <w:r>
-        <w:t>7. Specify pilot population, test data and feedback route.</w:t>
-      </w:r>
-    </w:p>
-    <w:p>
-      <w:r>
-        <w:t>8. Run a red-team review and revise the charter.</w:t>
+        <w:t>1. Load the approved JD and anchored rubric from Activity 2 or use the supplied fallback rubric.</w:t>
+      </w:r>
+    </w:p>
+    <w:p>
+      <w:r>
+        <w:t>2. Review the six synthetic resumes without adding new criteria.</w:t>
+      </w:r>
+    </w:p>
+    <w:p>
+      <w:r>
+        <w:t>3. Prompt Copilot to extract evidence for each criterion and mark missing information as unknown.</w:t>
+      </w:r>
+    </w:p>
+    <w:p>
+      <w:r>
+        <w:t>4. Verify every extracted item against the source resume.</w:t>
+      </w:r>
+    </w:p>
+    <w:p>
+      <w:r>
+        <w:t>5. Calculate rubric results using transparent workbook formulas.</w:t>
+      </w:r>
+    </w:p>
+    <w:p>
+      <w:r>
+        <w:t>6. Check for proxy variables, inconsistent standards and false negative risk.</w:t>
+      </w:r>
+    </w:p>
+    <w:p>
+      <w:r>
+        <w:t>7. Record the authorised recruiter's shortlist decision separately from AI output.</w:t>
+      </w:r>
+    </w:p>
+    <w:p>
+      <w:r>
+        <w:t>8. Pass the shortlisted evidence and unresolved questions to Activity 4.</w:t>
       </w:r>
     </w:p>
     <w:p>
@@ -1818,7 +2544,7 @@
     </w:p>
     <w:p>
       <w:r>
-        <w:t>You are supporting the Agentic AI for HR case. Use only the supplied synthetic evidence. Task: Convert an opportunity into a testable pilot charter with go/no-go gates. State assumptions, cite the evidence used, distinguish observation from inference, identify uncertainty, and list the human checks required before use.</w:t>
+        <w:t>You are supporting the Agentic AI for HR case. Use only the supplied synthetic evidence. Task: Use Microsoft 365 Copilot to extract job-related evidence at speed while keeping shortlist decisions human, traceable and reviewable. State assumptions, cite the evidence used, distinguish observation from inference, identify uncertainty, and list the human checks required before use.</w:t>
       </w:r>
     </w:p>
     <w:p>
@@ -1834,23 +2560,23 @@
         <w:pStyle w:val="ListBullet"/>
       </w:pPr>
       <w:r>
-        <w:t>Pilot charter</w:t>
-      </w:r>
-    </w:p>
-    <w:p>
-      <w:pPr>
-        <w:pStyle w:val="ListBullet"/>
-      </w:pPr>
-      <w:r>
-        <w:t>RACI</w:t>
-      </w:r>
-    </w:p>
-    <w:p>
-      <w:pPr>
-        <w:pStyle w:val="ListBullet"/>
-      </w:pPr>
-      <w:r>
-        <w:t>Metric baseline and gate table</w:t>
+        <w:t>Candidate evidence matrix</w:t>
+      </w:r>
+    </w:p>
+    <w:p>
+      <w:pPr>
+        <w:pStyle w:val="ListBullet"/>
+      </w:pPr>
+      <w:r>
+        <w:t>Uncertainty and bias log</w:t>
+      </w:r>
+    </w:p>
+    <w:p>
+      <w:pPr>
+        <w:pStyle w:val="ListBullet"/>
+      </w:pPr>
+      <w:r>
+        <w:t>Human shortlist rationale</w:t>
       </w:r>
     </w:p>
     <w:p>
@@ -1866,23 +2592,23 @@
         <w:pStyle w:val="ListBullet"/>
       </w:pPr>
       <w:r>
-        <w:t>Synthetic or de-identified pilot data</w:t>
-      </w:r>
-    </w:p>
-    <w:p>
-      <w:pPr>
-        <w:pStyle w:val="ListBullet"/>
-      </w:pPr>
-      <w:r>
-        <w:t>Named risk owner</w:t>
-      </w:r>
-    </w:p>
-    <w:p>
-      <w:pPr>
-        <w:pStyle w:val="ListBullet"/>
-      </w:pPr>
-      <w:r>
-        <w:t>Kill switch and rollback</w:t>
+        <w:t>Synthetic resumes only</w:t>
+      </w:r>
+    </w:p>
+    <w:p>
+      <w:pPr>
+        <w:pStyle w:val="ListBullet"/>
+      </w:pPr>
+      <w:r>
+        <w:t>Protected attributes and proxies excluded</w:t>
+      </w:r>
+    </w:p>
+    <w:p>
+      <w:pPr>
+        <w:pStyle w:val="ListBullet"/>
+      </w:pPr>
+      <w:r>
+        <w:t>AI may organise evidence but cannot reject a candidate</w:t>
       </w:r>
     </w:p>
     <w:p>
@@ -1903,7 +2629,7 @@
         <w:pStyle w:val="ListNumber"/>
       </w:pPr>
       <w:r>
-        <w:t>Which decision remains human and why?</w:t>
+        <w:t>Where could absence of evidence become an unfair negative assumption?</w:t>
       </w:r>
     </w:p>
     <w:p>
@@ -1911,7 +2637,7 @@
         <w:pStyle w:val="ListNumber"/>
       </w:pPr>
       <w:r>
-        <w:t>Who can stop the pilot?</w:t>
+        <w:t>How can a candidate challenge or correct the evidence?</w:t>
       </w:r>
     </w:p>
     <w:p>
@@ -1919,7 +2645,7 @@
         <w:pStyle w:val="ListNumber"/>
       </w:pPr>
       <w:r>
-        <w:t>What would a misleading success metric reward?</w:t>
+        <w:t>Which screening error creates the greatest harm?</w:t>
       </w:r>
     </w:p>
     <w:p>
@@ -2403,6 +3129,106 @@
         <w:pStyle w:val="Heading3"/>
       </w:pPr>
       <w:r>
+        <w:t>Personalisation across the employee journey</w:t>
+      </w:r>
+    </w:p>
+    <w:p>
+      <w:r>
+        <w:t>AI can tailor support when personalisation is grounded, explainable and correctable.</w:t>
+      </w:r>
+    </w:p>
+    <w:p>
+      <w:pPr>
+        <w:pStyle w:val="ListBullet"/>
+      </w:pPr>
+      <w:r>
+        <w:t>Onboarding adapts approved tasks to role and location</w:t>
+      </w:r>
+    </w:p>
+    <w:p>
+      <w:pPr>
+        <w:pStyle w:val="ListBullet"/>
+      </w:pPr>
+      <w:r>
+        <w:t>Learning recommendations connect evidenced gaps to approved resources</w:t>
+      </w:r>
+    </w:p>
+    <w:p>
+      <w:pPr>
+        <w:pStyle w:val="ListBullet"/>
+      </w:pPr>
+      <w:r>
+        <w:t>Internal mobility surfaces explainable options rather than deterministic rankings</w:t>
+      </w:r>
+    </w:p>
+    <w:p>
+      <w:pPr>
+        <w:pStyle w:val="ListBullet"/>
+      </w:pPr>
+      <w:r>
+        <w:t>Employee-service agents answer routine questions and escalate personal exceptions</w:t>
+      </w:r>
+    </w:p>
+    <w:p>
+      <w:r>
+        <w:t>Sources: AI Revolution in Human Resources: Transforming HR Management with Artificial Intelligence (2023 user-supplied ebook); https://www.microsoft.com/en-us/microsoft-copilot/copilot-101/ai-for-hr</w:t>
+      </w:r>
+    </w:p>
+    <w:p>
+      <w:pPr>
+        <w:pStyle w:val="Heading3"/>
+      </w:pPr>
+      <w:r>
+        <w:t>Predictive talent analytics with guardrails</w:t>
+      </w:r>
+    </w:p>
+    <w:p>
+      <w:r>
+        <w:t>Forecasts should guide questions and planning, not make hidden decisions about people.</w:t>
+      </w:r>
+    </w:p>
+    <w:p>
+      <w:pPr>
+        <w:pStyle w:val="ListBullet"/>
+      </w:pPr>
+      <w:r>
+        <w:t>Anticipate staffing needs from demand and skills evidence</w:t>
+      </w:r>
+    </w:p>
+    <w:p>
+      <w:pPr>
+        <w:pStyle w:val="ListBullet"/>
+      </w:pPr>
+      <w:r>
+        <w:t>Identify organisational retention and capability patterns</w:t>
+      </w:r>
+    </w:p>
+    <w:p>
+      <w:pPr>
+        <w:pStyle w:val="ListBullet"/>
+      </w:pPr>
+      <w:r>
+        <w:t>Test data quality, proxies, drift and uncertainty</w:t>
+      </w:r>
+    </w:p>
+    <w:p>
+      <w:pPr>
+        <w:pStyle w:val="ListBullet"/>
+      </w:pPr>
+      <w:r>
+        <w:t>Keep high-potential, performance and wellbeing decisions human and contestable</w:t>
+      </w:r>
+    </w:p>
+    <w:p>
+      <w:r>
+        <w:t>Sources: AI Revolution in Human Resources: Transforming HR Management with Artificial Intelligence (2023 user-supplied ebook); https://www.pdpc.gov.sg/help-and-resources/2020/01/model-ai-governance-framework</w:t>
+      </w:r>
+    </w:p>
+    <w:p>
+      <w:pPr>
+        <w:pStyle w:val="Heading3"/>
+      </w:pPr>
+      <w:r>
         <w:t>Performance and development</w:t>
       </w:r>
     </w:p>
@@ -2558,7 +3384,7 @@
         <w:pStyle w:val="Heading2"/>
       </w:pPr>
       <w:r>
-        <w:t>Activity 4: Build a Fair Resume Evidence Matrix</w:t>
+        <w:t>Activity 4: Prepare and Review Structured Interviews with AI</w:t>
       </w:r>
     </w:p>
     <w:p>
@@ -2571,7 +3397,7 @@
     </w:p>
     <w:p>
       <w:r>
-        <w:t>HarbourLight received six synthetic applications for the Workforce Operations Analyst role. The hiring manager wants a fast shortlist without an opaque score.</w:t>
+        <w:t>The recruiter shortlisted three candidates in Activity 3. Managers currently improvise interview questions, take incomplete notes and struggle to compare evidence consistently.</w:t>
       </w:r>
     </w:p>
     <w:p>
@@ -2584,7 +3410,7 @@
     </w:p>
     <w:p>
       <w:r>
-        <w:t>Use Microsoft 365 Copilot to extract job-related evidence and prepare a human-reviewed shortlist.</w:t>
+        <w:t>Use Copilot to prepare job-related structured questions, organise synthetic interview notes and support a human panel decision.</w:t>
       </w:r>
     </w:p>
     <w:p>
@@ -2597,7 +3423,7 @@
     </w:p>
     <w:p>
       <w:r>
-        <w:t>Excel with Microsoft 365 Copilot; Word</w:t>
+        <w:t>Word and Teams with Microsoft 365 Copilot; Excel</w:t>
       </w:r>
     </w:p>
     <w:p>
@@ -2610,42 +3436,42 @@
     </w:p>
     <w:p>
       <w:r>
-        <w:t>1. Read the approved job outcomes and anchored rubric.</w:t>
-      </w:r>
-    </w:p>
-    <w:p>
-      <w:r>
-        <w:t>2. Review the six synthetic resumes without adding criteria.</w:t>
-      </w:r>
-    </w:p>
-    <w:p>
-      <w:r>
-        <w:t>3. Prompt Copilot to extract verbatim evidence for each criterion and mark gaps as unknown.</w:t>
-      </w:r>
-    </w:p>
-    <w:p>
-      <w:r>
-        <w:t>4. Check every extracted item against the source resume.</w:t>
-      </w:r>
-    </w:p>
-    <w:p>
-      <w:r>
-        <w:t>5. Calculate rubric totals using workbook formulas; do not let Copilot invent a score.</w:t>
-      </w:r>
-    </w:p>
-    <w:p>
-      <w:r>
-        <w:t>6. Review for proxy variables and inconsistent evidence standards.</w:t>
-      </w:r>
-    </w:p>
-    <w:p>
-      <w:r>
-        <w:t>7. Record human shortlist decisions and reasons separately from the AI extraction.</w:t>
-      </w:r>
-    </w:p>
-    <w:p>
-      <w:r>
-        <w:t>8. Draft candidate next-step messages without disclosing other candidates' information.</w:t>
+        <w:t>1. Review the JD outcomes, rubric and shortlisted evidence from Activities 2–3.</w:t>
+      </w:r>
+    </w:p>
+    <w:p>
+      <w:r>
+        <w:t>2. Ask Copilot to draft behavioural questions linked to each job outcome.</w:t>
+      </w:r>
+    </w:p>
+    <w:p>
+      <w:r>
+        <w:t>3. Create anchored indicators for strong, partial and insufficient evidence.</w:t>
+      </w:r>
+    </w:p>
+    <w:p>
+      <w:r>
+        <w:t>4. Add accessibility, candidate-consent and prohibited-question checks.</w:t>
+      </w:r>
+    </w:p>
+    <w:p>
+      <w:r>
+        <w:t>5. Run the supplied synthetic interview transcripts or role-play the panel.</w:t>
+      </w:r>
+    </w:p>
+    <w:p>
+      <w:r>
+        <w:t>6. Use Copilot to organise notes by criterion without inferring intent, truthfulness or personality.</w:t>
+      </w:r>
+    </w:p>
+    <w:p>
+      <w:r>
+        <w:t>7. Have panel members score independently, then record evidence-based consensus.</w:t>
+      </w:r>
+    </w:p>
+    <w:p>
+      <w:r>
+        <w:t>8. Draft consistent offer, hold and decline communications for human approval.</w:t>
       </w:r>
     </w:p>
     <w:p>
@@ -2658,7 +3484,7 @@
     </w:p>
     <w:p>
       <w:r>
-        <w:t>You are supporting the Agentic AI for HR case. Use only the supplied synthetic evidence. Task: Use Microsoft 365 Copilot to extract job-related evidence and prepare a human-reviewed shortlist. State assumptions, cite the evidence used, distinguish observation from inference, identify uncertainty, and list the human checks required before use.</w:t>
+        <w:t>You are supporting the Agentic AI for HR case. Use only the supplied synthetic evidence. Task: Use Copilot to prepare job-related structured questions, organise synthetic interview notes and support a human panel decision. State assumptions, cite the evidence used, distinguish observation from inference, identify uncertainty, and list the human checks required before use.</w:t>
       </w:r>
     </w:p>
     <w:p>
@@ -2674,23 +3500,23 @@
         <w:pStyle w:val="ListBullet"/>
       </w:pPr>
       <w:r>
-        <w:t>Evidence matrix</w:t>
-      </w:r>
-    </w:p>
-    <w:p>
-      <w:pPr>
-        <w:pStyle w:val="ListBullet"/>
-      </w:pPr>
-      <w:r>
-        <w:t>Uncertainty log</w:t>
-      </w:r>
-    </w:p>
-    <w:p>
-      <w:pPr>
-        <w:pStyle w:val="ListBullet"/>
-      </w:pPr>
-      <w:r>
-        <w:t>Human shortlist rationale</w:t>
+        <w:t>Structured interview guide</w:t>
+      </w:r>
+    </w:p>
+    <w:p>
+      <w:pPr>
+        <w:pStyle w:val="ListBullet"/>
+      </w:pPr>
+      <w:r>
+        <w:t>Anchored panel scorecard</w:t>
+      </w:r>
+    </w:p>
+    <w:p>
+      <w:pPr>
+        <w:pStyle w:val="ListBullet"/>
+      </w:pPr>
+      <w:r>
+        <w:t>Candidate communication pack</w:t>
       </w:r>
     </w:p>
     <w:p>
@@ -2706,23 +3532,23 @@
         <w:pStyle w:val="ListBullet"/>
       </w:pPr>
       <w:r>
-        <w:t>Synthetic resumes only</w:t>
-      </w:r>
-    </w:p>
-    <w:p>
-      <w:pPr>
-        <w:pStyle w:val="ListBullet"/>
-      </w:pPr>
-      <w:r>
-        <w:t>Protected attributes excluded</w:t>
-      </w:r>
-    </w:p>
-    <w:p>
-      <w:pPr>
-        <w:pStyle w:val="ListBullet"/>
-      </w:pPr>
-      <w:r>
-        <w:t>AI cannot reject candidates</w:t>
+        <w:t>Same core questions for every candidate</w:t>
+      </w:r>
+    </w:p>
+    <w:p>
+      <w:pPr>
+        <w:pStyle w:val="ListBullet"/>
+      </w:pPr>
+      <w:r>
+        <w:t>No emotion or personality inference</w:t>
+      </w:r>
+    </w:p>
+    <w:p>
+      <w:pPr>
+        <w:pStyle w:val="ListBullet"/>
+      </w:pPr>
+      <w:r>
+        <w:t>Panel members score independently before consensus</w:t>
       </w:r>
     </w:p>
     <w:p>
@@ -2743,7 +3569,7 @@
         <w:pStyle w:val="ListNumber"/>
       </w:pPr>
       <w:r>
-        <w:t>Where did missing evidence risk becoming a negative assumption?</w:t>
+        <w:t>Which question best tests a role outcome rather than similarity to the panel?</w:t>
       </w:r>
     </w:p>
     <w:p>
@@ -2751,7 +3577,7 @@
         <w:pStyle w:val="ListNumber"/>
       </w:pPr>
       <w:r>
-        <w:t>What would make this screening process contestable?</w:t>
+        <w:t>What interview evidence should Copilot never infer?</w:t>
       </w:r>
     </w:p>
     <w:p>
@@ -2759,7 +3585,7 @@
         <w:pStyle w:val="ListNumber"/>
       </w:pPr>
       <w:r>
-        <w:t>Which errors matter most: false inclusion or false exclusion?</w:t>
+        <w:t>How will disagreements between panel members be resolved?</w:t>
       </w:r>
     </w:p>
     <w:p>
@@ -2772,7 +3598,7 @@
         <w:pStyle w:val="Heading2"/>
       </w:pPr>
       <w:r>
-        <w:t>Activity 5: Draft and Govern an HR Policy Update</w:t>
+        <w:t>Activity 5: Automate Onboarding Coordination</w:t>
       </w:r>
     </w:p>
     <w:p>
@@ -2785,7 +3611,7 @@
     </w:p>
     <w:p>
       <w:r>
-        <w:t>Hybrid-work guidance exists in three conflicting documents. Employees receive inconsistent answers and managers are applying different approval rules.</w:t>
+        <w:t>A selected synthetic candidate joins HarbourLight as the Workforce Operations Analyst. Equipment, access, safety training and manager check-ins are currently coordinated through emails and spreadsheets, causing missed tasks and repeated follow-up.</w:t>
       </w:r>
     </w:p>
     <w:p>
@@ -2798,7 +3624,7 @@
     </w:p>
     <w:p>
       <w:r>
-        <w:t>Use Word Copilot to compare sources and prepare a controlled policy draft plus communication plan.</w:t>
+        <w:t>Design a Copilot Studio onboarding agent that coordinates routine work while retaining accountable task owners and human confirmation.</w:t>
       </w:r>
     </w:p>
     <w:p>
@@ -2811,7 +3637,7 @@
     </w:p>
     <w:p>
       <w:r>
-        <w:t>Word with Microsoft 365 Copilot; SharePoint</w:t>
+        <w:t>Microsoft Copilot Studio; Teams; SharePoint; Power Automate or agent flows</w:t>
       </w:r>
     </w:p>
     <w:p>
@@ -2824,42 +3650,42 @@
     </w:p>
     <w:p>
       <w:r>
-        <w:t>1. Review the three synthetic policy extracts and source metadata.</w:t>
-      </w:r>
-    </w:p>
-    <w:p>
-      <w:r>
-        <w:t>2. Ask Copilot to identify conflicts, gaps and undefined terms with citations.</w:t>
-      </w:r>
-    </w:p>
-    <w:p>
-      <w:r>
-        <w:t>3. Confirm the policy hierarchy with the scenario brief.</w:t>
-      </w:r>
-    </w:p>
-    <w:p>
-      <w:r>
-        <w:t>4. Draft a plain-language policy using the approved rule set.</w:t>
-      </w:r>
-    </w:p>
-    <w:p>
-      <w:r>
-        <w:t>5. Add examples, exceptions and an escalation route.</w:t>
-      </w:r>
-    </w:p>
-    <w:p>
-      <w:r>
-        <w:t>6. Run a privacy, fairness and operational feasibility review.</w:t>
-      </w:r>
-    </w:p>
-    <w:p>
-      <w:r>
-        <w:t>7. Create the approval, publication and acknowledgement plan.</w:t>
-      </w:r>
-    </w:p>
-    <w:p>
-      <w:r>
-        <w:t>8. Archive superseded content and record the version change.</w:t>
+        <w:t>1. Map the Day 1, Week 1 and Days 8–30 employee outcomes.</w:t>
+      </w:r>
+    </w:p>
+    <w:p>
+      <w:r>
+        <w:t>2. Separate informational answers, recommendations and transactional tasks.</w:t>
+      </w:r>
+    </w:p>
+    <w:p>
+      <w:r>
+        <w:t>3. Use Copilot to draft a role-specific journey from approved JD and policy sources.</w:t>
+      </w:r>
+    </w:p>
+    <w:p>
+      <w:r>
+        <w:t>4. Create the agent purpose, instructions, knowledge and escalation boundaries.</w:t>
+      </w:r>
+    </w:p>
+    <w:p>
+      <w:r>
+        <w:t>5. Design deterministic tools for task creation, reminders and status retrieval.</w:t>
+      </w:r>
+    </w:p>
+    <w:p>
+      <w:r>
+        <w:t>6. Require human confirmation before closing access, equipment or safety tasks.</w:t>
+      </w:r>
+    </w:p>
+    <w:p>
+      <w:r>
+        <w:t>7. Test normal, missing-manager, late-equipment and confidential-question scenarios.</w:t>
+      </w:r>
+    </w:p>
+    <w:p>
+      <w:r>
+        <w:t>8. Record cycle-time reduction, exceptions and employee feedback for Activity 12.</w:t>
       </w:r>
     </w:p>
     <w:p>
@@ -2872,7 +3698,7 @@
     </w:p>
     <w:p>
       <w:r>
-        <w:t>You are supporting the Agentic AI for HR case. Use only the supplied synthetic evidence. Task: Use Word Copilot to compare sources and prepare a controlled policy draft plus communication plan. State assumptions, cite the evidence used, distinguish observation from inference, identify uncertainty, and list the human checks required before use.</w:t>
+        <w:t>You are supporting the Agentic AI for HR case. Use only the supplied synthetic evidence. Task: Design a Copilot Studio onboarding agent that coordinates routine work while retaining accountable task owners and human confirmation. State assumptions, cite the evidence used, distinguish observation from inference, identify uncertainty, and list the human checks required before use.</w:t>
       </w:r>
     </w:p>
     <w:p>
@@ -2888,23 +3714,23 @@
         <w:pStyle w:val="ListBullet"/>
       </w:pPr>
       <w:r>
-        <w:t>Conflict register</w:t>
-      </w:r>
-    </w:p>
-    <w:p>
-      <w:pPr>
-        <w:pStyle w:val="ListBullet"/>
-      </w:pPr>
-      <w:r>
-        <w:t>Policy draft</w:t>
-      </w:r>
-    </w:p>
-    <w:p>
-      <w:pPr>
-        <w:pStyle w:val="ListBullet"/>
-      </w:pPr>
-      <w:r>
-        <w:t>Approval and communication checklist</w:t>
+        <w:t>30-day journey</w:t>
+      </w:r>
+    </w:p>
+    <w:p>
+      <w:pPr>
+        <w:pStyle w:val="ListBullet"/>
+      </w:pPr>
+      <w:r>
+        <w:t>Agent conversation and tool map</w:t>
+      </w:r>
+    </w:p>
+    <w:p>
+      <w:pPr>
+        <w:pStyle w:val="ListBullet"/>
+      </w:pPr>
+      <w:r>
+        <w:t>Onboarding test report</w:t>
       </w:r>
     </w:p>
     <w:p>
@@ -2920,23 +3746,23 @@
         <w:pStyle w:val="ListBullet"/>
       </w:pPr>
       <w:r>
-        <w:t>Only approved source documents</w:t>
-      </w:r>
-    </w:p>
-    <w:p>
-      <w:pPr>
-        <w:pStyle w:val="ListBullet"/>
-      </w:pPr>
-      <w:r>
-        <w:t>Policy owner signs off</w:t>
-      </w:r>
-    </w:p>
-    <w:p>
-      <w:pPr>
-        <w:pStyle w:val="ListBullet"/>
-      </w:pPr>
-      <w:r>
-        <w:t>Effective date and superseded versions recorded</w:t>
+        <w:t>Use approved role and policy data</w:t>
+      </w:r>
+    </w:p>
+    <w:p>
+      <w:pPr>
+        <w:pStyle w:val="ListBullet"/>
+      </w:pPr>
+      <w:r>
+        <w:t>Least-privilege connectors</w:t>
+      </w:r>
+    </w:p>
+    <w:p>
+      <w:pPr>
+        <w:pStyle w:val="ListBullet"/>
+      </w:pPr>
+      <w:r>
+        <w:t>A human owner confirms every completion</w:t>
       </w:r>
     </w:p>
     <w:p>
@@ -2957,7 +3783,7 @@
         <w:pStyle w:val="ListNumber"/>
       </w:pPr>
       <w:r>
-        <w:t>Which conflict could create unequal treatment?</w:t>
+        <w:t>Which work is safely automated and which remains owned by a person?</w:t>
       </w:r>
     </w:p>
     <w:p>
@@ -2965,7 +3791,7 @@
         <w:pStyle w:val="ListNumber"/>
       </w:pPr>
       <w:r>
-        <w:t>What must not be inferred by Copilot?</w:t>
+        <w:t>Where could duplicate tasks be created?</w:t>
       </w:r>
     </w:p>
     <w:p>
@@ -2973,7 +3799,7 @@
         <w:pStyle w:val="ListNumber"/>
       </w:pPr>
       <w:r>
-        <w:t>How will users know which version is authoritative?</w:t>
+        <w:t>What proves the new joiner is ready rather than the checklist merely complete?</w:t>
       </w:r>
     </w:p>
     <w:p>
@@ -2986,7 +3812,7 @@
         <w:pStyle w:val="Heading2"/>
       </w:pPr>
       <w:r>
-        <w:t>Activity 6: Create a Personalised Onboarding Journey</w:t>
+        <w:t>Activity 6: Create a Personalised Talent Development Journey</w:t>
       </w:r>
     </w:p>
     <w:p>
@@ -2999,7 +3825,7 @@
     </w:p>
     <w:p>
       <w:r>
-        <w:t>Three new employees join the distribution hub in different roles and locations. HR needs a consistent core journey with role-specific support.</w:t>
+        <w:t>After onboarding, the new analyst and two existing employees need different development pathways. HR currently assembles courses manually and managers lack a consistent skills-conversation structure.</w:t>
       </w:r>
     </w:p>
     <w:p>
@@ -3012,7 +3838,7 @@
     </w:p>
     <w:p>
       <w:r>
-        <w:t>Use Microsoft 365 Copilot to prepare role-based onboarding plans, communications and learning prompts.</w:t>
+        <w:t>Use Copilot and a bounded development agent to identify evidence-based skill gaps, prepare learning options and automate routine follow-up.</w:t>
       </w:r>
     </w:p>
     <w:p>
@@ -3025,7 +3851,7 @@
     </w:p>
     <w:p>
       <w:r>
-        <w:t>Teams; Word and Outlook with Microsoft 365 Copilot; Excel</w:t>
+        <w:t>Microsoft 365 Copilot in Word and Teams; Agent Builder in Microsoft 365 Copilot; Excel</w:t>
       </w:r>
     </w:p>
     <w:p>
@@ -3038,42 +3864,42 @@
     </w:p>
     <w:p>
       <w:r>
-        <w:t>1. Review the three synthetic personas, role outcomes and mandatory controls.</w:t>
-      </w:r>
-    </w:p>
-    <w:p>
-      <w:r>
-        <w:t>2. Define a common Day 1, Week 1 and Days 8–30 backbone.</w:t>
-      </w:r>
-    </w:p>
-    <w:p>
-      <w:r>
-        <w:t>3. Prompt Copilot to personalise tasks from role, location and approved learning needs.</w:t>
-      </w:r>
-    </w:p>
-    <w:p>
-      <w:r>
-        <w:t>4. Check access, safety, policy, network and learning coverage.</w:t>
-      </w:r>
-    </w:p>
-    <w:p>
-      <w:r>
-        <w:t>5. Draft manager and new-joiner communications in Outlook.</w:t>
-      </w:r>
-    </w:p>
-    <w:p>
-      <w:r>
-        <w:t>6. Assign owners and due dates in the workbook.</w:t>
-      </w:r>
-    </w:p>
-    <w:p>
-      <w:r>
-        <w:t>7. Add a feedback pulse and exception route.</w:t>
-      </w:r>
-    </w:p>
-    <w:p>
-      <w:r>
-        <w:t>8. Compare journeys for consistency and unintended disadvantage.</w:t>
+        <w:t>1. Review the role outcomes, employee aspirations and synthetic performance evidence.</w:t>
+      </w:r>
+    </w:p>
+    <w:p>
+      <w:r>
+        <w:t>2. Separate observed capability, self-reported interest and unsupported inference.</w:t>
+      </w:r>
+    </w:p>
+    <w:p>
+      <w:r>
+        <w:t>3. Ask Copilot to map evidenced gaps to approved learning and stretch options.</w:t>
+      </w:r>
+    </w:p>
+    <w:p>
+      <w:r>
+        <w:t>4. Draft a 90-day plan with milestones, practice and manager support.</w:t>
+      </w:r>
+    </w:p>
+    <w:p>
+      <w:r>
+        <w:t>5. Create a bounded Agent Builder agent over approved learning resources.</w:t>
+      </w:r>
+    </w:p>
+    <w:p>
+      <w:r>
+        <w:t>6. Add instructions for explainable recommendations, consent and escalation.</w:t>
+      </w:r>
+    </w:p>
+    <w:p>
+      <w:r>
+        <w:t>7. Test irrelevant, inaccessible and sensitive development requests.</w:t>
+      </w:r>
+    </w:p>
+    <w:p>
+      <w:r>
+        <w:t>8. Record employee corrections, manager approval and follow-up reminders.</w:t>
       </w:r>
     </w:p>
     <w:p>
@@ -3086,7 +3912,7 @@
     </w:p>
     <w:p>
       <w:r>
-        <w:t>You are supporting the Agentic AI for HR case. Use only the supplied synthetic evidence. Task: Use Microsoft 365 Copilot to prepare role-based onboarding plans, communications and learning prompts. State assumptions, cite the evidence used, distinguish observation from inference, identify uncertainty, and list the human checks required before use.</w:t>
+        <w:t>You are supporting the Agentic AI for HR case. Use only the supplied synthetic evidence. Task: Use Copilot and a bounded development agent to identify evidence-based skill gaps, prepare learning options and automate routine follow-up. State assumptions, cite the evidence used, distinguish observation from inference, identify uncertainty, and list the human checks required before use.</w:t>
       </w:r>
     </w:p>
     <w:p>
@@ -3102,23 +3928,23 @@
         <w:pStyle w:val="ListBullet"/>
       </w:pPr>
       <w:r>
-        <w:t>30-day onboarding plans</w:t>
-      </w:r>
-    </w:p>
-    <w:p>
-      <w:pPr>
-        <w:pStyle w:val="ListBullet"/>
-      </w:pPr>
-      <w:r>
-        <w:t>Welcome communications</w:t>
-      </w:r>
-    </w:p>
-    <w:p>
-      <w:pPr>
-        <w:pStyle w:val="ListBullet"/>
-      </w:pPr>
-      <w:r>
-        <w:t>Milestone and owner tracker</w:t>
+        <w:t>Skills evidence summary</w:t>
+      </w:r>
+    </w:p>
+    <w:p>
+      <w:pPr>
+        <w:pStyle w:val="ListBullet"/>
+      </w:pPr>
+      <w:r>
+        <w:t>90-day development plan</w:t>
+      </w:r>
+    </w:p>
+    <w:p>
+      <w:pPr>
+        <w:pStyle w:val="ListBullet"/>
+      </w:pPr>
+      <w:r>
+        <w:t>Development-agent instructions and tests</w:t>
       </w:r>
     </w:p>
     <w:p>
@@ -3134,23 +3960,23 @@
         <w:pStyle w:val="ListBullet"/>
       </w:pPr>
       <w:r>
-        <w:t>Use only approved role and policy data</w:t>
-      </w:r>
-    </w:p>
-    <w:p>
-      <w:pPr>
-        <w:pStyle w:val="ListBullet"/>
-      </w:pPr>
-      <w:r>
-        <w:t>Do not infer personal needs</w:t>
-      </w:r>
-    </w:p>
-    <w:p>
-      <w:pPr>
-        <w:pStyle w:val="ListBullet"/>
-      </w:pPr>
-      <w:r>
-        <w:t>New joiner can request adjustments</w:t>
+        <w:t>Employee can correct the skills record</w:t>
+      </w:r>
+    </w:p>
+    <w:p>
+      <w:pPr>
+        <w:pStyle w:val="ListBullet"/>
+      </w:pPr>
+      <w:r>
+        <w:t>No deterministic potential ranking</w:t>
+      </w:r>
+    </w:p>
+    <w:p>
+      <w:pPr>
+        <w:pStyle w:val="ListBullet"/>
+      </w:pPr>
+      <w:r>
+        <w:t>Manager and employee choose the final plan</w:t>
       </w:r>
     </w:p>
     <w:p>
@@ -3171,7 +3997,7 @@
         <w:pStyle w:val="ListNumber"/>
       </w:pPr>
       <w:r>
-        <w:t>What should remain standard for every new joiner?</w:t>
+        <w:t>How can the employee challenge the skills profile?</w:t>
       </w:r>
     </w:p>
     <w:p>
@@ -3179,7 +4005,7 @@
         <w:pStyle w:val="ListNumber"/>
       </w:pPr>
       <w:r>
-        <w:t>Which personalisation requires consent?</w:t>
+        <w:t>What would make a recommendation explainable?</w:t>
       </w:r>
     </w:p>
     <w:p>
@@ -3187,7 +4013,7 @@
         <w:pStyle w:val="ListNumber"/>
       </w:pPr>
       <w:r>
-        <w:t>How will HR detect an onboarding access failure early?</w:t>
+        <w:t>Which development decision should never be automated?</w:t>
       </w:r>
     </w:p>
     <w:p>
@@ -3371,6 +4197,56 @@
         <w:pStyle w:val="Heading3"/>
       </w:pPr>
       <w:r>
+        <w:t>Integrate with the HR technology stack</w:t>
+      </w:r>
+    </w:p>
+    <w:p>
+      <w:r>
+        <w:t>Agents become useful when identity, HRIS data, workflows and monitoring are deliberately connected.</w:t>
+      </w:r>
+    </w:p>
+    <w:p>
+      <w:pPr>
+        <w:pStyle w:val="ListBullet"/>
+      </w:pPr>
+      <w:r>
+        <w:t>HRIS and policy repositories remain authoritative systems of record</w:t>
+      </w:r>
+    </w:p>
+    <w:p>
+      <w:pPr>
+        <w:pStyle w:val="ListBullet"/>
+      </w:pPr>
+      <w:r>
+        <w:t>Identity and permissions restrict personal data and transactions</w:t>
+      </w:r>
+    </w:p>
+    <w:p>
+      <w:pPr>
+        <w:pStyle w:val="ListBullet"/>
+      </w:pPr>
+      <w:r>
+        <w:t>Connectors and APIs expose only bounded, validated actions</w:t>
+      </w:r>
+    </w:p>
+    <w:p>
+      <w:pPr>
+        <w:pStyle w:val="ListBullet"/>
+      </w:pPr>
+      <w:r>
+        <w:t>Logging, fallback and human support make failures recoverable</w:t>
+      </w:r>
+    </w:p>
+    <w:p>
+      <w:r>
+        <w:t>Sources: AI Revolution in Human Resources: Transforming HR Management with Artificial Intelligence (2023 user-supplied ebook); https://www.microsoft.com/en-sg/microsoft-365-copilot/microsoft-copilot-studio</w:t>
+      </w:r>
+    </w:p>
+    <w:p>
+      <w:pPr>
+        <w:pStyle w:val="Heading3"/>
+      </w:pPr>
+      <w:r>
         <w:t>Knowledge grounding</w:t>
       </w:r>
     </w:p>
@@ -3826,7 +4702,7 @@
         <w:pStyle w:val="Heading2"/>
       </w:pPr>
       <w:r>
-        <w:t>Activity 7: Build an HR Policy Q&amp;A Agent</w:t>
+        <w:t>Activity 7: Draft and Operate an HR Policy Agent</w:t>
       </w:r>
     </w:p>
     <w:p>
@@ -3839,7 +4715,7 @@
     </w:p>
     <w:p>
       <w:r>
-        <w:t>Employees ask repetitive hybrid-work and benefits questions in Teams. HR needs a reliable self-service front door that cites policy and escalates exceptions.</w:t>
+        <w:t>Hybrid-work and conduct guidance exists in conflicting files. HR repeatedly answers the same questions and managers sometimes apply outdated rules.</w:t>
       </w:r>
     </w:p>
     <w:p>
@@ -3852,7 +4728,7 @@
     </w:p>
     <w:p>
       <w:r>
-        <w:t>Create a bounded policy agent in Agent Builder for Microsoft 365 Copilot and test grounded answers.</w:t>
+        <w:t>Use Word Copilot to reconcile a controlled policy draft, then build an Agent Builder policy Q&amp;A agent that cites the approved version.</w:t>
       </w:r>
     </w:p>
     <w:p>
@@ -3865,7 +4741,7 @@
     </w:p>
     <w:p>
       <w:r>
-        <w:t>Agent Builder in Microsoft 365 Copilot; SharePoint; Teams</w:t>
+        <w:t>Word with Microsoft 365 Copilot; Agent Builder in Microsoft 365 Copilot; SharePoint; Teams</w:t>
       </w:r>
     </w:p>
     <w:p>
@@ -3878,42 +4754,42 @@
     </w:p>
     <w:p>
       <w:r>
-        <w:t>1. Define the audience, in-scope intents and explicit exclusions.</w:t>
-      </w:r>
-    </w:p>
-    <w:p>
-      <w:r>
-        <w:t>2. Select the approved synthetic policy knowledge files.</w:t>
-      </w:r>
-    </w:p>
-    <w:p>
-      <w:r>
-        <w:t>3. Write instructions for citation, effective date, clarification, refusal and escalation.</w:t>
-      </w:r>
-    </w:p>
-    <w:p>
-      <w:r>
-        <w:t>4. Create the agent in Agent Builder and add the knowledge sources.</w:t>
-      </w:r>
-    </w:p>
-    <w:p>
-      <w:r>
-        <w:t>5. Add conversation starters for common employee intents.</w:t>
-      </w:r>
-    </w:p>
-    <w:p>
-      <w:r>
-        <w:t>6. Run normal, ambiguous, outdated-policy and sensitive-personal-case tests.</w:t>
-      </w:r>
-    </w:p>
-    <w:p>
-      <w:r>
-        <w:t>7. Record answer, citation, pass/fail and corrective action.</w:t>
-      </w:r>
-    </w:p>
-    <w:p>
-      <w:r>
-        <w:t>8. Share only with the test group after the policy owner approves.</w:t>
+        <w:t>1. Compare the supplied policy extracts and identify conflicts, gaps and obsolete wording.</w:t>
+      </w:r>
+    </w:p>
+    <w:p>
+      <w:r>
+        <w:t>2. Confirm the authoritative rule hierarchy with the scenario brief.</w:t>
+      </w:r>
+    </w:p>
+    <w:p>
+      <w:r>
+        <w:t>3. Use Word Copilot to prepare a plain-language controlled draft.</w:t>
+      </w:r>
+    </w:p>
+    <w:p>
+      <w:r>
+        <w:t>4. Record approval, effective date, superseded versions and communication plan.</w:t>
+      </w:r>
+    </w:p>
+    <w:p>
+      <w:r>
+        <w:t>5. Create the Agent Builder purpose, knowledge and response boundaries.</w:t>
+      </w:r>
+    </w:p>
+    <w:p>
+      <w:r>
+        <w:t>6. Require citations, effective dates, clarification, refusal and escalation.</w:t>
+      </w:r>
+    </w:p>
+    <w:p>
+      <w:r>
+        <w:t>7. Test normal, ambiguous, outdated-policy and personal-exception questions.</w:t>
+      </w:r>
+    </w:p>
+    <w:p>
+      <w:r>
+        <w:t>8. Record administrative time saved and the new monitoring workload.</w:t>
       </w:r>
     </w:p>
     <w:p>
@@ -3926,7 +4802,7 @@
     </w:p>
     <w:p>
       <w:r>
-        <w:t>You are supporting the Agentic AI for HR case. Use only the supplied synthetic evidence. Task: Create a bounded policy agent in Agent Builder for Microsoft 365 Copilot and test grounded answers. State assumptions, cite the evidence used, distinguish observation from inference, identify uncertainty, and list the human checks required before use.</w:t>
+        <w:t>You are supporting the Agentic AI for HR case. Use only the supplied synthetic evidence. Task: Use Word Copilot to reconcile a controlled policy draft, then build an Agent Builder policy Q&amp;A agent that cites the approved version. State assumptions, cite the evidence used, distinguish observation from inference, identify uncertainty, and list the human checks required before use.</w:t>
       </w:r>
     </w:p>
     <w:p>
@@ -3942,15 +4818,15 @@
         <w:pStyle w:val="ListBullet"/>
       </w:pPr>
       <w:r>
-        <w:t>Agent purpose and instructions</w:t>
-      </w:r>
-    </w:p>
-    <w:p>
-      <w:pPr>
-        <w:pStyle w:val="ListBullet"/>
-      </w:pPr>
-      <w:r>
-        <w:t>Knowledge map</w:t>
+        <w:t>Conflict register and policy draft</w:t>
+      </w:r>
+    </w:p>
+    <w:p>
+      <w:pPr>
+        <w:pStyle w:val="ListBullet"/>
+      </w:pPr>
+      <w:r>
+        <w:t>Agent instructions and knowledge map</w:t>
       </w:r>
     </w:p>
     <w:p>
@@ -3974,23 +4850,23 @@
         <w:pStyle w:val="ListBullet"/>
       </w:pPr>
       <w:r>
-        <w:t>Cite approved policy</w:t>
-      </w:r>
-    </w:p>
-    <w:p>
-      <w:pPr>
-        <w:pStyle w:val="ListBullet"/>
-      </w:pPr>
-      <w:r>
-        <w:t>No personalised entitlement decisions</w:t>
-      </w:r>
-    </w:p>
-    <w:p>
-      <w:pPr>
-        <w:pStyle w:val="ListBullet"/>
-      </w:pPr>
-      <w:r>
-        <w:t>Escalate ambiguity and sensitive cases</w:t>
+        <w:t>Policy owner approves meaning</w:t>
+      </w:r>
+    </w:p>
+    <w:p>
+      <w:pPr>
+        <w:pStyle w:val="ListBullet"/>
+      </w:pPr>
+      <w:r>
+        <w:t>Answers cite effective policy</w:t>
+      </w:r>
+    </w:p>
+    <w:p>
+      <w:pPr>
+        <w:pStyle w:val="ListBullet"/>
+      </w:pPr>
+      <w:r>
+        <w:t>Ambiguous and sensitive cases escalate</w:t>
       </w:r>
     </w:p>
     <w:p>
@@ -4011,7 +4887,7 @@
         <w:pStyle w:val="ListNumber"/>
       </w:pPr>
       <w:r>
-        <w:t>What makes an answer grounded rather than merely plausible?</w:t>
+        <w:t>What makes an answer grounded rather than plausible?</w:t>
       </w:r>
     </w:p>
     <w:p>
@@ -4019,7 +4895,7 @@
         <w:pStyle w:val="ListNumber"/>
       </w:pPr>
       <w:r>
-        <w:t>When should the agent stop answering?</w:t>
+        <w:t>Which exception requires a policy owner instead of an agent?</w:t>
       </w:r>
     </w:p>
     <w:p>
@@ -4027,7 +4903,7 @@
         <w:pStyle w:val="ListNumber"/>
       </w:pPr>
       <w:r>
-        <w:t>What new operating work does this agent create?</w:t>
+        <w:t>What operating work is created when self-service is introduced?</w:t>
       </w:r>
     </w:p>
     <w:p>
@@ -4040,7 +4916,7 @@
         <w:pStyle w:val="Heading2"/>
       </w:pPr>
       <w:r>
-        <w:t>Activity 8: Design an Onboarding Coordination Agent</w:t>
+        <w:t>Activity 8: Automate Leave Application and Approval</w:t>
       </w:r>
     </w:p>
     <w:p>
@@ -4053,7 +4929,7 @@
     </w:p>
     <w:p>
       <w:r>
-        <w:t>New joiners miss equipment, access and manager check-ins because work is spread across email, service tickets and spreadsheets.</w:t>
+        <w:t>Employees message leave dates to HR, which rekeys requests into a tracker and follows up with managers. Balance errors, overlaps and duplicate submissions create avoidable administration.</w:t>
       </w:r>
     </w:p>
     <w:p>
@@ -4066,7 +4942,7 @@
     </w:p>
     <w:p>
       <w:r>
-        <w:t>Design a Copilot Studio agent that coordinates onboarding while retaining accountable task owners.</w:t>
+        <w:t>Build a Copilot Studio leave agent plus deterministic approval flow for validation, confirmation, update and notification.</w:t>
       </w:r>
     </w:p>
     <w:p>
@@ -4079,7 +4955,7 @@
     </w:p>
     <w:p>
       <w:r>
-        <w:t>Microsoft Copilot Studio; Teams; SharePoint; Power Automate or agent flows</w:t>
+        <w:t>Microsoft Copilot Studio; Agent flows or Power Automate; Teams; Excel or HRIS sandbox</w:t>
       </w:r>
     </w:p>
     <w:p>
@@ -4092,42 +4968,42 @@
     </w:p>
     <w:p>
       <w:r>
-        <w:t>1. Map the onboarding trigger, milestones, systems and owners.</w:t>
-      </w:r>
-    </w:p>
-    <w:p>
-      <w:r>
-        <w:t>2. Define what the agent may answer, recommend and execute.</w:t>
-      </w:r>
-    </w:p>
-    <w:p>
-      <w:r>
-        <w:t>3. Create the Copilot Studio agent purpose and instructions.</w:t>
-      </w:r>
-    </w:p>
-    <w:p>
-      <w:r>
-        <w:t>4. Add approved knowledge and a new-joiner profile input.</w:t>
-      </w:r>
-    </w:p>
-    <w:p>
-      <w:r>
-        <w:t>5. Design tools for task creation, reminder and status retrieval.</w:t>
-      </w:r>
-    </w:p>
-    <w:p>
-      <w:r>
-        <w:t>6. Add human confirmation before closing an access or equipment task.</w:t>
-      </w:r>
-    </w:p>
-    <w:p>
-      <w:r>
-        <w:t>7. Test normal joiner, missing manager, late equipment and confidential-question scenarios.</w:t>
-      </w:r>
-    </w:p>
-    <w:p>
-      <w:r>
-        <w:t>8. Review analytics and hand the pilot to named owners.</w:t>
+        <w:t>1. Review the approved leave policy, balances, calendars and synthetic requests.</w:t>
+      </w:r>
+    </w:p>
+    <w:p>
+      <w:r>
+        <w:t>2. Define required inputs, privacy boundaries and validation messages.</w:t>
+      </w:r>
+    </w:p>
+    <w:p>
+      <w:r>
+        <w:t>3. Design the conversation to clarify dates, leave type, coverage and contact preferences.</w:t>
+      </w:r>
+    </w:p>
+    <w:p>
+      <w:r>
+        <w:t>4. Create deterministic checks for balance, overlap and approval routing.</w:t>
+      </w:r>
+    </w:p>
+    <w:p>
+      <w:r>
+        <w:t>5. Add a final employee confirmation before the agent invokes the flow.</w:t>
+      </w:r>
+    </w:p>
+    <w:p>
+      <w:r>
+        <w:t>6. Write approved, rejected and failed outcomes to the audit log.</w:t>
+      </w:r>
+    </w:p>
+    <w:p>
+      <w:r>
+        <w:t>7. Test insufficient balance, duplicate request, missing approver and connector failure.</w:t>
+      </w:r>
+    </w:p>
+    <w:p>
+      <w:r>
+        <w:t>8. Compare old rekeying time with the automated route and document human exceptions.</w:t>
       </w:r>
     </w:p>
     <w:p>
@@ -4140,7 +5016,7 @@
     </w:p>
     <w:p>
       <w:r>
-        <w:t>You are supporting the Agentic AI for HR case. Use only the supplied synthetic evidence. Task: Design a Copilot Studio agent that coordinates onboarding while retaining accountable task owners. State assumptions, cite the evidence used, distinguish observation from inference, identify uncertainty, and list the human checks required before use.</w:t>
+        <w:t>You are supporting the Agentic AI for HR case. Use only the supplied synthetic evidence. Task: Build a Copilot Studio leave agent plus deterministic approval flow for validation, confirmation, update and notification. State assumptions, cite the evidence used, distinguish observation from inference, identify uncertainty, and list the human checks required before use.</w:t>
       </w:r>
     </w:p>
     <w:p>
@@ -4156,23 +5032,23 @@
         <w:pStyle w:val="ListBullet"/>
       </w:pPr>
       <w:r>
-        <w:t>Conversation map</w:t>
-      </w:r>
-    </w:p>
-    <w:p>
-      <w:pPr>
-        <w:pStyle w:val="ListBullet"/>
-      </w:pPr>
-      <w:r>
-        <w:t>Tool and approval design</w:t>
-      </w:r>
-    </w:p>
-    <w:p>
-      <w:pPr>
-        <w:pStyle w:val="ListBullet"/>
-      </w:pPr>
-      <w:r>
-        <w:t>Test evidence</w:t>
+        <w:t>Agent instructions</w:t>
+      </w:r>
+    </w:p>
+    <w:p>
+      <w:pPr>
+        <w:pStyle w:val="ListBullet"/>
+      </w:pPr>
+      <w:r>
+        <w:t>Leave approval flow</w:t>
+      </w:r>
+    </w:p>
+    <w:p>
+      <w:pPr>
+        <w:pStyle w:val="ListBullet"/>
+      </w:pPr>
+      <w:r>
+        <w:t>Audit log and exception test report</w:t>
       </w:r>
     </w:p>
     <w:p>
@@ -4188,23 +5064,23 @@
         <w:pStyle w:val="ListBullet"/>
       </w:pPr>
       <w:r>
-        <w:t>Least-privilege connectors</w:t>
-      </w:r>
-    </w:p>
-    <w:p>
-      <w:pPr>
-        <w:pStyle w:val="ListBullet"/>
-      </w:pPr>
-      <w:r>
-        <w:t>No invented commitments</w:t>
-      </w:r>
-    </w:p>
-    <w:p>
-      <w:pPr>
-        <w:pStyle w:val="ListBullet"/>
-      </w:pPr>
-      <w:r>
-        <w:t>Human owner confirms every completion</w:t>
+        <w:t>Employee confirms before submission</w:t>
+      </w:r>
+    </w:p>
+    <w:p>
+      <w:pPr>
+        <w:pStyle w:val="ListBullet"/>
+      </w:pPr>
+      <w:r>
+        <w:t>Manager owns exceptions</w:t>
+      </w:r>
+    </w:p>
+    <w:p>
+      <w:pPr>
+        <w:pStyle w:val="ListBullet"/>
+      </w:pPr>
+      <w:r>
+        <w:t>Idempotency prevents duplicate actions</w:t>
       </w:r>
     </w:p>
     <w:p>
@@ -4225,7 +5101,7 @@
         <w:pStyle w:val="ListNumber"/>
       </w:pPr>
       <w:r>
-        <w:t>Which step is orchestration rather than content generation?</w:t>
+        <w:t>Which rule belongs in the flow rather than the language model?</w:t>
       </w:r>
     </w:p>
     <w:p>
@@ -4233,7 +5109,7 @@
         <w:pStyle w:val="ListNumber"/>
       </w:pPr>
       <w:r>
-        <w:t>Where could duplicate actions occur?</w:t>
+        <w:t>How will the system detect a duplicate request?</w:t>
       </w:r>
     </w:p>
     <w:p>
@@ -4241,7 +5117,7 @@
         <w:pStyle w:val="ListNumber"/>
       </w:pPr>
       <w:r>
-        <w:t>What evidence proves the joiner—not only the workflow—was ready?</w:t>
+        <w:t>Who resolves a disputed leave balance?</w:t>
       </w:r>
     </w:p>
     <w:p>
@@ -4254,7 +5130,7 @@
         <w:pStyle w:val="Heading2"/>
       </w:pPr>
       <w:r>
-        <w:t>Activity 9: Build a Leave Request Agent and Approval Flow</w:t>
+        <w:t>Activity 9: Build a Benefits Self-Service Agent</w:t>
       </w:r>
     </w:p>
     <w:p>
@@ -4267,7 +5143,7 @@
     </w:p>
     <w:p>
       <w:r>
-        <w:t>Employees submit leave through messages that HR rekeys into a tracker. Errors occur around balance, overlapping dates and manager approvals.</w:t>
+        <w:t>HR answers repetitive benefits questions by email and manually checks plan documents. Employees need fast information, but personal eligibility and claims require authenticated data and specialist review.</w:t>
       </w:r>
     </w:p>
     <w:p>
@@ -4280,7 +5156,7 @@
     </w:p>
     <w:p>
       <w:r>
-        <w:t>Design a Copilot Studio agent plus deterministic flow for eligibility, approval, update and notification.</w:t>
+        <w:t>Design a benefits agent that answers grounded general questions, retrieves authorised status and escalates consequential or sensitive cases.</w:t>
       </w:r>
     </w:p>
     <w:p>
@@ -4293,7 +5169,7 @@
     </w:p>
     <w:p>
       <w:r>
-        <w:t>Microsoft Copilot Studio; Agent flows or Power Automate; Teams; Excel or HRIS sandbox</w:t>
+        <w:t>Microsoft Copilot Studio; SharePoint; Teams; HRIS sandbox or mock connector</w:t>
       </w:r>
     </w:p>
     <w:p>
@@ -4306,42 +5182,42 @@
     </w:p>
     <w:p>
       <w:r>
-        <w:t>1. Review the synthetic leave policy, balances and requests.</w:t>
-      </w:r>
-    </w:p>
-    <w:p>
-      <w:r>
-        <w:t>2. Define required inputs and validation messages.</w:t>
-      </w:r>
-    </w:p>
-    <w:p>
-      <w:r>
-        <w:t>3. Design the conversation to clarify dates, leave type and coverage.</w:t>
-      </w:r>
-    </w:p>
-    <w:p>
-      <w:r>
-        <w:t>4. Create a deterministic flow for balance check, overlap check and approval routing.</w:t>
-      </w:r>
-    </w:p>
-    <w:p>
-      <w:r>
-        <w:t>5. Add a confirmation step before the agent calls the flow.</w:t>
-      </w:r>
-    </w:p>
-    <w:p>
-      <w:r>
-        <w:t>6. Write successful, rejected and failed outcomes to the audit log.</w:t>
-      </w:r>
-    </w:p>
-    <w:p>
-      <w:r>
-        <w:t>7. Test insufficient balance, duplicate request, missing approver and connector failure.</w:t>
-      </w:r>
-    </w:p>
-    <w:p>
-      <w:r>
-        <w:t>8. Review access permissions and the employee-facing explanation.</w:t>
+        <w:t>1. Classify the supplied benefits intents as answer, retrieve, transact or escalate.</w:t>
+      </w:r>
+    </w:p>
+    <w:p>
+      <w:r>
+        <w:t>2. Map the minimum knowledge and personal data needed for each intent.</w:t>
+      </w:r>
+    </w:p>
+    <w:p>
+      <w:r>
+        <w:t>3. Create grounded responses for general coverage and enrolment questions.</w:t>
+      </w:r>
+    </w:p>
+    <w:p>
+      <w:r>
+        <w:t>4. Design an authenticated tool for personal status retrieval using least privilege.</w:t>
+      </w:r>
+    </w:p>
+    <w:p>
+      <w:r>
+        <w:t>5. Add refusal and escalation patterns for claims disputes, medical details and ambiguous eligibility.</w:t>
+      </w:r>
+    </w:p>
+    <w:p>
+      <w:r>
+        <w:t>6. Test cross-employee data leakage, prompt injection, outdated plans and connector failure.</w:t>
+      </w:r>
+    </w:p>
+    <w:p>
+      <w:r>
+        <w:t>7. Record resolution, citation, escalation and employee feedback.</w:t>
+      </w:r>
+    </w:p>
+    <w:p>
+      <w:r>
+        <w:t>8. Estimate first-contact resolution and HR administrative time returned.</w:t>
       </w:r>
     </w:p>
     <w:p>
@@ -4354,7 +5230,7 @@
     </w:p>
     <w:p>
       <w:r>
-        <w:t>You are supporting the Agentic AI for HR case. Use only the supplied synthetic evidence. Task: Design a Copilot Studio agent plus deterministic flow for eligibility, approval, update and notification. State assumptions, cite the evidence used, distinguish observation from inference, identify uncertainty, and list the human checks required before use.</w:t>
+        <w:t>You are supporting the Agentic AI for HR case. Use only the supplied synthetic evidence. Task: Design a benefits agent that answers grounded general questions, retrieves authorised status and escalates consequential or sensitive cases. State assumptions, cite the evidence used, distinguish observation from inference, identify uncertainty, and list the human checks required before use.</w:t>
       </w:r>
     </w:p>
     <w:p>
@@ -4370,31 +5246,23 @@
         <w:pStyle w:val="ListBullet"/>
       </w:pPr>
       <w:r>
-        <w:t>Agent instructions</w:t>
-      </w:r>
-    </w:p>
-    <w:p>
-      <w:pPr>
-        <w:pStyle w:val="ListBullet"/>
-      </w:pPr>
-      <w:r>
-        <w:t>Flow design</w:t>
-      </w:r>
-    </w:p>
-    <w:p>
-      <w:pPr>
-        <w:pStyle w:val="ListBullet"/>
-      </w:pPr>
-      <w:r>
-        <w:t>Approval matrix</w:t>
-      </w:r>
-    </w:p>
-    <w:p>
-      <w:pPr>
-        <w:pStyle w:val="ListBullet"/>
-      </w:pPr>
-      <w:r>
-        <w:t>Audit log and test report</w:t>
+        <w:t>Benefits intent-and-risk catalogue</w:t>
+      </w:r>
+    </w:p>
+    <w:p>
+      <w:pPr>
+        <w:pStyle w:val="ListBullet"/>
+      </w:pPr>
+      <w:r>
+        <w:t>Knowledge and tool design</w:t>
+      </w:r>
+    </w:p>
+    <w:p>
+      <w:pPr>
+        <w:pStyle w:val="ListBullet"/>
+      </w:pPr>
+      <w:r>
+        <w:t>Privacy and regression test report</w:t>
       </w:r>
     </w:p>
     <w:p>
@@ -4410,23 +5278,23 @@
         <w:pStyle w:val="ListBullet"/>
       </w:pPr>
       <w:r>
-        <w:t>Confirm before submission</w:t>
-      </w:r>
-    </w:p>
-    <w:p>
-      <w:pPr>
-        <w:pStyle w:val="ListBullet"/>
-      </w:pPr>
-      <w:r>
-        <w:t>Manager approves exceptions</w:t>
-      </w:r>
-    </w:p>
-    <w:p>
-      <w:pPr>
-        <w:pStyle w:val="ListBullet"/>
-      </w:pPr>
-      <w:r>
-        <w:t>Idempotency prevents duplicates</w:t>
+        <w:t>General answers cite approved plan documents</w:t>
+      </w:r>
+    </w:p>
+    <w:p>
+      <w:pPr>
+        <w:pStyle w:val="ListBullet"/>
+      </w:pPr>
+      <w:r>
+        <w:t>Personal requests require authentication</w:t>
+      </w:r>
+    </w:p>
+    <w:p>
+      <w:pPr>
+        <w:pStyle w:val="ListBullet"/>
+      </w:pPr>
+      <w:r>
+        <w:t>No medical, legal or final entitlement advice</w:t>
       </w:r>
     </w:p>
     <w:p>
@@ -4447,7 +5315,7 @@
         <w:pStyle w:val="ListNumber"/>
       </w:pPr>
       <w:r>
-        <w:t>Which rule belongs in the flow rather than the language model?</w:t>
+        <w:t>Why should one conversational front door not have one permission set?</w:t>
       </w:r>
     </w:p>
     <w:p>
@@ -4455,7 +5323,7 @@
         <w:pStyle w:val="ListNumber"/>
       </w:pPr>
       <w:r>
-        <w:t>How will a duplicate submission be detected?</w:t>
+        <w:t>Which benefits question requires immediate human review?</w:t>
       </w:r>
     </w:p>
     <w:p>
@@ -4463,7 +5331,7 @@
         <w:pStyle w:val="ListNumber"/>
       </w:pPr>
       <w:r>
-        <w:t>Who resolves a disputed balance?</w:t>
+        <w:t>How will employees know the source and effective date of an answer?</w:t>
       </w:r>
     </w:p>
     <w:p>
@@ -4597,6 +5465,156 @@
         <w:pStyle w:val="Heading3"/>
       </w:pPr>
       <w:r>
+        <w:t>From HR efficiency to enterprise value</w:t>
+      </w:r>
+    </w:p>
+    <w:p>
+      <w:r>
+        <w:t>The strongest human-AI partnerships deliver better workforce solutions, speed and business impact.</w:t>
+      </w:r>
+    </w:p>
+    <w:p>
+      <w:pPr>
+        <w:pStyle w:val="ListBullet"/>
+      </w:pPr>
+      <w:r>
+        <w:t>Workforce solutions become more personalised and responsive</w:t>
+      </w:r>
+    </w:p>
+    <w:p>
+      <w:pPr>
+        <w:pStyle w:val="ListBullet"/>
+      </w:pPr>
+      <w:r>
+        <w:t>Agile portfolio management reduces time from need to usable service</w:t>
+      </w:r>
+    </w:p>
+    <w:p>
+      <w:pPr>
+        <w:pStyle w:val="ListBullet"/>
+      </w:pPr>
+      <w:r>
+        <w:t>Administrative capacity shifts to strategic and business-facing work</w:t>
+      </w:r>
+    </w:p>
+    <w:p>
+      <w:pPr>
+        <w:pStyle w:val="ListBullet"/>
+      </w:pPr>
+      <w:r>
+        <w:t>AI and technology fluency becomes a capability across HR, not an HRIS silo</w:t>
+      </w:r>
+    </w:p>
+    <w:p>
+      <w:r>
+        <w:t>Sources: Deloitte, The Future of HR, Powered by AI (user-supplied reference deck)</w:t>
+      </w:r>
+    </w:p>
+    <w:p>
+      <w:pPr>
+        <w:pStyle w:val="Heading3"/>
+      </w:pPr>
+      <w:r>
+        <w:t>Four implementation case vignettes</w:t>
+      </w:r>
+    </w:p>
+    <w:p>
+      <w:r>
+        <w:t>The supplied ebook illustrates value across recruitment, engagement, talent and performance.</w:t>
+      </w:r>
+    </w:p>
+    <w:p>
+      <w:pPr>
+        <w:pStyle w:val="ListBullet"/>
+      </w:pPr>
+      <w:r>
+        <w:t>Technology: screening and candidate chat; reported 30% faster hiring</w:t>
+      </w:r>
+    </w:p>
+    <w:p>
+      <w:pPr>
+        <w:pStyle w:val="ListBullet"/>
+      </w:pPr>
+      <w:r>
+        <w:t>Retail: feedback analysis; reported 20% lower turnover</w:t>
+      </w:r>
+    </w:p>
+    <w:p>
+      <w:pPr>
+        <w:pStyle w:val="ListBullet"/>
+      </w:pPr>
+      <w:r>
+        <w:t>Financial services: predictive talent and succession development</w:t>
+      </w:r>
+    </w:p>
+    <w:p>
+      <w:pPr>
+        <w:pStyle w:val="ListBullet"/>
+      </w:pPr>
+      <w:r>
+        <w:t>Healthcare: timely evidence for coaching and reviews</w:t>
+      </w:r>
+    </w:p>
+    <w:p>
+      <w:r>
+        <w:t>Sources: AI Revolution in Human Resources: Transforming HR Management with Artificial Intelligence (2023 user-supplied ebook)</w:t>
+      </w:r>
+    </w:p>
+    <w:p>
+      <w:pPr>
+        <w:pStyle w:val="Heading3"/>
+      </w:pPr>
+      <w:r>
+        <w:t>What successful implementations share</w:t>
+      </w:r>
+    </w:p>
+    <w:p>
+      <w:r>
+        <w:t>Technology works when objectives, people, monitoring and cross-functional ownership reinforce one another.</w:t>
+      </w:r>
+    </w:p>
+    <w:p>
+      <w:pPr>
+        <w:pStyle w:val="ListBullet"/>
+      </w:pPr>
+      <w:r>
+        <w:t>Start with a clear employee or business outcome</w:t>
+      </w:r>
+    </w:p>
+    <w:p>
+      <w:pPr>
+        <w:pStyle w:val="ListBullet"/>
+      </w:pPr>
+      <w:r>
+        <w:t>Involve employees early in design, testing and feedback</w:t>
+      </w:r>
+    </w:p>
+    <w:p>
+      <w:pPr>
+        <w:pStyle w:val="ListBullet"/>
+      </w:pPr>
+      <w:r>
+        <w:t>Continuously monitor quality, bias, drift and unintended effects</w:t>
+      </w:r>
+    </w:p>
+    <w:p>
+      <w:pPr>
+        <w:pStyle w:val="ListBullet"/>
+      </w:pPr>
+      <w:r>
+        <w:t>Pair HR process ownership with IT, legal, security and data expertise</w:t>
+      </w:r>
+    </w:p>
+    <w:p>
+      <w:r>
+        <w:t>Sources: AI Revolution in Human Resources: Transforming HR Management with Artificial Intelligence (2023 user-supplied ebook)</w:t>
+      </w:r>
+    </w:p>
+    <w:p>
+      <w:pPr>
+        <w:pStyle w:val="Heading3"/>
+      </w:pPr>
+      <w:r>
         <w:t>Privacy by design</w:t>
       </w:r>
     </w:p>
@@ -5047,6 +6065,56 @@
         <w:pStyle w:val="Heading3"/>
       </w:pPr>
       <w:r>
+        <w:t>Build HR's AI capability</w:t>
+      </w:r>
+    </w:p>
+    <w:p>
+      <w:r>
+        <w:t>HR needs literacy, ethical judgement, product thinking and change leadership to operate AI well.</w:t>
+      </w:r>
+    </w:p>
+    <w:p>
+      <w:pPr>
+        <w:pStyle w:val="ListBullet"/>
+      </w:pPr>
+      <w:r>
+        <w:t>Teach AI capabilities, limitations and evidence review</w:t>
+      </w:r>
+    </w:p>
+    <w:p>
+      <w:pPr>
+        <w:pStyle w:val="ListBullet"/>
+      </w:pPr>
+      <w:r>
+        <w:t>Establish privacy, fairness and responsible-use guidelines</w:t>
+      </w:r>
+    </w:p>
+    <w:p>
+      <w:pPr>
+        <w:pStyle w:val="ListBullet"/>
+      </w:pPr>
+      <w:r>
+        <w:t>Create cross-functional teams for design and sustainment</w:t>
+      </w:r>
+    </w:p>
+    <w:p>
+      <w:pPr>
+        <w:pStyle w:val="ListBullet"/>
+      </w:pPr>
+      <w:r>
+        <w:t>Communicate role changes and build continuous learning into work</w:t>
+      </w:r>
+    </w:p>
+    <w:p>
+      <w:r>
+        <w:t>Sources: AI Revolution in Human Resources: Transforming HR Management with Artificial Intelligence (2023 user-supplied ebook); Deloitte, The Future of HR, Powered by AI (user-supplied reference deck)</w:t>
+      </w:r>
+    </w:p>
+    <w:p>
+      <w:pPr>
+        <w:pStyle w:val="Heading3"/>
+      </w:pPr>
+      <w:r>
         <w:t>90-day responsible roadmap</w:t>
       </w:r>
     </w:p>
@@ -5102,7 +6170,7 @@
         <w:pStyle w:val="Heading2"/>
       </w:pPr>
       <w:r>
-        <w:t>Activity 10: Prepare a Fair Performance and Learning Conversation</w:t>
+        <w:t>Activity 10: Use AI for Workforce Wellness Insights</w:t>
       </w:r>
     </w:p>
     <w:p>
@@ -5115,7 +6183,7 @@
     </w:p>
     <w:p>
       <w:r>
-        <w:t>A manager has fragmented notes, goals and service metrics for two employees and wants Copilot to draft development conversations.</w:t>
+        <w:t>HarbourLight has pulse surveys, absence patterns and workload data, but HR spends days combining them. Leaders want early signals without monitoring or diagnosing individuals.</w:t>
       </w:r>
     </w:p>
     <w:p>
@@ -5128,7 +6196,7 @@
     </w:p>
     <w:p>
       <w:r>
-        <w:t>Use Copilot to organise evidence, distinguish observation from inference and prepare human-led coaching.</w:t>
+        <w:t>Use Copilot to analyse aggregated wellness evidence, identify organisational questions and prepare human-led interventions.</w:t>
       </w:r>
     </w:p>
     <w:p>
@@ -5141,7 +6209,7 @@
     </w:p>
     <w:p>
       <w:r>
-        <w:t>Word and Teams with Microsoft 365 Copilot; Excel</w:t>
+        <w:t>Excel with Microsoft 365 Copilot; Teams; Word</w:t>
       </w:r>
     </w:p>
     <w:p>
@@ -5154,42 +6222,42 @@
     </w:p>
     <w:p>
       <w:r>
-        <w:t>1. Review the synthetic goals, evidence and contextual notes.</w:t>
-      </w:r>
-    </w:p>
-    <w:p>
-      <w:r>
-        <w:t>2. Label each item as observation, result, feedback, context or unsupported inference.</w:t>
-      </w:r>
-    </w:p>
-    <w:p>
-      <w:r>
-        <w:t>3. Ask Copilot to summarise evidence by agreed goal and cite the source.</w:t>
-      </w:r>
-    </w:p>
-    <w:p>
-      <w:r>
-        <w:t>4. Challenge the summary for recency and confirmation bias.</w:t>
-      </w:r>
-    </w:p>
-    <w:p>
-      <w:r>
-        <w:t>5. Draft coaching questions that invite the employee's perspective.</w:t>
-      </w:r>
-    </w:p>
-    <w:p>
-      <w:r>
-        <w:t>6. Map agreed gaps to learning and stretch options.</w:t>
-      </w:r>
-    </w:p>
-    <w:p>
-      <w:r>
-        <w:t>7. Record employee corrections and final human judgement.</w:t>
-      </w:r>
-    </w:p>
-    <w:p>
-      <w:r>
-        <w:t>8. Check that the plan supports development rather than surveillance.</w:t>
+        <w:t>1. Review the synthetic aggregated survey, workload and absence tables.</w:t>
+      </w:r>
+    </w:p>
+    <w:p>
+      <w:r>
+        <w:t>2. Check denominators, missing groups, small samples and data quality.</w:t>
+      </w:r>
+    </w:p>
+    <w:p>
+      <w:r>
+        <w:t>3. Ask Copilot to identify patterns with cell references and uncertainty.</w:t>
+      </w:r>
+    </w:p>
+    <w:p>
+      <w:r>
+        <w:t>4. Separate correlation, employee voice and unsupported causal claims.</w:t>
+      </w:r>
+    </w:p>
+    <w:p>
+      <w:r>
+        <w:t>5. Create organisational hypotheses about workload, support and work design.</w:t>
+      </w:r>
+    </w:p>
+    <w:p>
+      <w:r>
+        <w:t>6. Draft options such as manager support, process redesign and voluntary resources.</w:t>
+      </w:r>
+    </w:p>
+    <w:p>
+      <w:r>
+        <w:t>7. Run privacy, stigma, fairness and communication checks.</w:t>
+      </w:r>
+    </w:p>
+    <w:p>
+      <w:r>
+        <w:t>8. Record the human owner, feedback route and measures for evaluating the intervention.</w:t>
       </w:r>
     </w:p>
     <w:p>
@@ -5202,7 +6270,7 @@
     </w:p>
     <w:p>
       <w:r>
-        <w:t>You are supporting the Agentic AI for HR case. Use only the supplied synthetic evidence. Task: Use Copilot to organise evidence, distinguish observation from inference and prepare human-led coaching. State assumptions, cite the evidence used, distinguish observation from inference, identify uncertainty, and list the human checks required before use.</w:t>
+        <w:t>You are supporting the Agentic AI for HR case. Use only the supplied synthetic evidence. Task: Use Copilot to analyse aggregated wellness evidence, identify organisational questions and prepare human-led interventions. State assumptions, cite the evidence used, distinguish observation from inference, identify uncertainty, and list the human checks required before use.</w:t>
       </w:r>
     </w:p>
     <w:p>
@@ -5218,23 +6286,23 @@
         <w:pStyle w:val="ListBullet"/>
       </w:pPr>
       <w:r>
-        <w:t>Evidence summary</w:t>
-      </w:r>
-    </w:p>
-    <w:p>
-      <w:pPr>
-        <w:pStyle w:val="ListBullet"/>
-      </w:pPr>
-      <w:r>
-        <w:t>Coaching questions</w:t>
-      </w:r>
-    </w:p>
-    <w:p>
-      <w:pPr>
-        <w:pStyle w:val="ListBullet"/>
-      </w:pPr>
-      <w:r>
-        <w:t>Learning plan</w:t>
+        <w:t>Aggregated wellness dashboard brief</w:t>
+      </w:r>
+    </w:p>
+    <w:p>
+      <w:pPr>
+        <w:pStyle w:val="ListBullet"/>
+      </w:pPr>
+      <w:r>
+        <w:t>Evidence-and-limitation log</w:t>
+      </w:r>
+    </w:p>
+    <w:p>
+      <w:pPr>
+        <w:pStyle w:val="ListBullet"/>
+      </w:pPr>
+      <w:r>
+        <w:t>Human-led intervention proposal</w:t>
       </w:r>
     </w:p>
     <w:p>
@@ -5250,23 +6318,23 @@
         <w:pStyle w:val="ListBullet"/>
       </w:pPr>
       <w:r>
-        <w:t>No personality inference</w:t>
-      </w:r>
-    </w:p>
-    <w:p>
-      <w:pPr>
-        <w:pStyle w:val="ListBullet"/>
-      </w:pPr>
-      <w:r>
-        <w:t>Employee can correct evidence</w:t>
-      </w:r>
-    </w:p>
-    <w:p>
-      <w:pPr>
-        <w:pStyle w:val="ListBullet"/>
-      </w:pPr>
-      <w:r>
-        <w:t>Manager owns the conversation and rating</w:t>
+        <w:t>Aggregate and minimise personal data</w:t>
+      </w:r>
+    </w:p>
+    <w:p>
+      <w:pPr>
+        <w:pStyle w:val="ListBullet"/>
+      </w:pPr>
+      <w:r>
+        <w:t>No diagnosis or individual risk scoring</w:t>
+      </w:r>
+    </w:p>
+    <w:p>
+      <w:pPr>
+        <w:pStyle w:val="ListBullet"/>
+      </w:pPr>
+      <w:r>
+        <w:t>Employees have a clear human support route</w:t>
       </w:r>
     </w:p>
     <w:p>
@@ -5287,7 +6355,7 @@
         <w:pStyle w:val="ListNumber"/>
       </w:pPr>
       <w:r>
-        <w:t>Which evidence is relevant but not sufficient?</w:t>
+        <w:t>Which attractive insight is not safe to act on?</w:t>
       </w:r>
     </w:p>
     <w:p>
@@ -5295,7 +6363,7 @@
         <w:pStyle w:val="ListNumber"/>
       </w:pPr>
       <w:r>
-        <w:t>How can the employee contest the summary?</w:t>
+        <w:t>How does aggregation reduce but not eliminate privacy risk?</w:t>
       </w:r>
     </w:p>
     <w:p>
@@ -5303,7 +6371,7 @@
         <w:pStyle w:val="ListNumber"/>
       </w:pPr>
       <w:r>
-        <w:t>What should Copilot never infer from tone or activity data?</w:t>
+        <w:t>What response supports people without surveillance?</w:t>
       </w:r>
     </w:p>
     <w:p>
@@ -5316,7 +6384,7 @@
         <w:pStyle w:val="Heading2"/>
       </w:pPr>
       <w:r>
-        <w:t>Activity 11: Design Safe Employee Service and Offboarding</w:t>
+        <w:t>Activity 11: Automate Safe Employee Offboarding</w:t>
       </w:r>
     </w:p>
     <w:p>
@@ -5329,7 +6397,7 @@
     </w:p>
     <w:p>
       <w:r>
-        <w:t>HR wants one conversational front door for benefits, payroll status, employee-relations triage and offboarding tasks.</w:t>
+        <w:t>A synthetic employee is leaving HarbourLight. HR currently coordinates payroll, assets, access, knowledge transfer and exit communication through separate emails, creating missed tasks and security risk.</w:t>
       </w:r>
     </w:p>
     <w:p>
@@ -5342,7 +6410,7 @@
     </w:p>
     <w:p>
       <w:r>
-        <w:t>Define privacy-aware routing, escalation and least-privilege actions across sensitive HR services.</w:t>
+        <w:t>Design a Copilot Studio offboarding agent and controlled flow that reduces follow-up while preserving separation of duties and respectful communication.</w:t>
       </w:r>
     </w:p>
     <w:p>
@@ -5355,7 +6423,7 @@
     </w:p>
     <w:p>
       <w:r>
-        <w:t>Microsoft Copilot Studio; Teams; SharePoint; HRIS sandbox</w:t>
+        <w:t>Microsoft Copilot Studio; Power Automate or agent flows; Teams; SharePoint; HRIS sandbox</w:t>
       </w:r>
     </w:p>
     <w:p>
@@ -5368,42 +6436,42 @@
     </w:p>
     <w:p>
       <w:r>
-        <w:t>1. Classify the supplied intents by sensitivity, consequence and reversibility.</w:t>
-      </w:r>
-    </w:p>
-    <w:p>
-      <w:r>
-        <w:t>2. Decide which intents are answer, retrieve, transact or escalate.</w:t>
-      </w:r>
-    </w:p>
-    <w:p>
-      <w:r>
-        <w:t>3. Map authentication and minimum data for each service.</w:t>
-      </w:r>
-    </w:p>
-    <w:p>
-      <w:r>
-        <w:t>4. Design response patterns for payroll dispute, wellbeing disclosure and employee-relations complaint.</w:t>
-      </w:r>
-    </w:p>
-    <w:p>
-      <w:r>
-        <w:t>5. Build the offboarding sequence for confirmation, assets, access and knowledge transfer.</w:t>
-      </w:r>
-    </w:p>
-    <w:p>
-      <w:r>
-        <w:t>6. Assign maker, approver and verifier roles.</w:t>
-      </w:r>
-    </w:p>
-    <w:p>
-      <w:r>
-        <w:t>7. Test data leakage, social engineering, urgent safety and incomplete exit scenarios.</w:t>
-      </w:r>
-    </w:p>
-    <w:p>
-      <w:r>
-        <w:t>8. Record operational owner, retention and incident response.</w:t>
+        <w:t>1. Confirm the synthetic exit type, date, obligations and accountable owners.</w:t>
+      </w:r>
+    </w:p>
+    <w:p>
+      <w:r>
+        <w:t>2. Map employee, manager, HR, payroll, IT, facilities and knowledge-transfer outcomes.</w:t>
+      </w:r>
+    </w:p>
+    <w:p>
+      <w:r>
+        <w:t>3. Use Copilot to draft respectful, role-appropriate communications.</w:t>
+      </w:r>
+    </w:p>
+    <w:p>
+      <w:r>
+        <w:t>4. Create agent instructions that disclose status without exposing sensitive reasons.</w:t>
+      </w:r>
+    </w:p>
+    <w:p>
+      <w:r>
+        <w:t>5. Design deterministic tasks for assets, final pay, access and records.</w:t>
+      </w:r>
+    </w:p>
+    <w:p>
+      <w:r>
+        <w:t>6. Require authorised confirmation before disabling access or closing obligations.</w:t>
+      </w:r>
+    </w:p>
+    <w:p>
+      <w:r>
+        <w:t>7. Test cancelled exit, early access removal, missing asset, data leakage and connector failure.</w:t>
+      </w:r>
+    </w:p>
+    <w:p>
+      <w:r>
+        <w:t>8. Record completion evidence, employee experience and lessons for Activity 12.</w:t>
       </w:r>
     </w:p>
     <w:p>
@@ -5416,7 +6484,7 @@
     </w:p>
     <w:p>
       <w:r>
-        <w:t>You are supporting the Agentic AI for HR case. Use only the supplied synthetic evidence. Task: Define privacy-aware routing, escalation and least-privilege actions across sensitive HR services. State assumptions, cite the evidence used, distinguish observation from inference, identify uncertainty, and list the human checks required before use.</w:t>
+        <w:t>You are supporting the Agentic AI for HR case. Use only the supplied synthetic evidence. Task: Design a Copilot Studio offboarding agent and controlled flow that reduces follow-up while preserving separation of duties and respectful communication. State assumptions, cite the evidence used, distinguish observation from inference, identify uncertainty, and list the human checks required before use.</w:t>
       </w:r>
     </w:p>
     <w:p>
@@ -5432,23 +6500,23 @@
         <w:pStyle w:val="ListBullet"/>
       </w:pPr>
       <w:r>
-        <w:t>Intent-and-risk catalogue</w:t>
-      </w:r>
-    </w:p>
-    <w:p>
-      <w:pPr>
-        <w:pStyle w:val="ListBullet"/>
-      </w:pPr>
-      <w:r>
-        <w:t>Escalation matrix</w:t>
-      </w:r>
-    </w:p>
-    <w:p>
-      <w:pPr>
-        <w:pStyle w:val="ListBullet"/>
-      </w:pPr>
-      <w:r>
-        <w:t>Offboarding control map</w:t>
+        <w:t>Offboarding journey and RACI</w:t>
+      </w:r>
+    </w:p>
+    <w:p>
+      <w:pPr>
+        <w:pStyle w:val="ListBullet"/>
+      </w:pPr>
+      <w:r>
+        <w:t>Tool and approval map</w:t>
+      </w:r>
+    </w:p>
+    <w:p>
+      <w:pPr>
+        <w:pStyle w:val="ListBullet"/>
+      </w:pPr>
+      <w:r>
+        <w:t>Security, privacy and failure test report</w:t>
       </w:r>
     </w:p>
     <w:p>
@@ -5464,23 +6532,23 @@
         <w:pStyle w:val="ListBullet"/>
       </w:pPr>
       <w:r>
-        <w:t>Authenticate personal requests</w:t>
-      </w:r>
-    </w:p>
-    <w:p>
-      <w:pPr>
-        <w:pStyle w:val="ListBullet"/>
-      </w:pPr>
-      <w:r>
-        <w:t>No legal or clinical advice</w:t>
-      </w:r>
-    </w:p>
-    <w:p>
-      <w:pPr>
-        <w:pStyle w:val="ListBullet"/>
-      </w:pPr>
-      <w:r>
-        <w:t>Separation of duties for access removal</w:t>
+        <w:t>Confirmed exit event before action</w:t>
+      </w:r>
+    </w:p>
+    <w:p>
+      <w:pPr>
+        <w:pStyle w:val="ListBullet"/>
+      </w:pPr>
+      <w:r>
+        <w:t>Separate HR, payroll, asset and access approvals</w:t>
+      </w:r>
+    </w:p>
+    <w:p>
+      <w:pPr>
+        <w:pStyle w:val="ListBullet"/>
+      </w:pPr>
+      <w:r>
+        <w:t>Knowledge and personal data retention are purpose-limited</w:t>
       </w:r>
     </w:p>
     <w:p>
@@ -5501,7 +6569,7 @@
         <w:pStyle w:val="ListNumber"/>
       </w:pPr>
       <w:r>
-        <w:t>Why should one front door not mean one permission set?</w:t>
+        <w:t>What evidence is required before access is removed?</w:t>
       </w:r>
     </w:p>
     <w:p>
@@ -5509,7 +6577,7 @@
         <w:pStyle w:val="ListNumber"/>
       </w:pPr>
       <w:r>
-        <w:t>Which disclosure demands an immediate human response?</w:t>
+        <w:t>Where is separation of duties essential?</w:t>
       </w:r>
     </w:p>
     <w:p>
@@ -5517,7 +6585,7 @@
         <w:pStyle w:val="ListNumber"/>
       </w:pPr>
       <w:r>
-        <w:t>What evidence is needed before access is removed?</w:t>
+        <w:t>How can automation preserve dignity during exit?</w:t>
       </w:r>
     </w:p>
     <w:p>
@@ -5543,7 +6611,7 @@
     </w:p>
     <w:p>
       <w:r>
-        <w:t>HarbourLight's pilot portfolio now includes policy, onboarding and leave agents. Leaders must decide whether to scale, remediate or stop each agent.</w:t>
+        <w:t>HarbourLight now uses generative AI and agents across talent planning, hiring, onboarding, development, policy, leave, benefits, wellness and offboarding. Leaders must decide what to scale, remediate, pause or retire.</w:t>
       </w:r>
     </w:p>
     <w:p>
@@ -5556,7 +6624,7 @@
     </w:p>
     <w:p>
       <w:r>
-        <w:t>Use service, risk, adoption and human-value evidence to make a defensible operating decision.</w:t>
+        <w:t>Use lifecycle, service, risk, adoption and human-value evidence to govern the full HR AI operating system.</w:t>
       </w:r>
     </w:p>
     <w:p>
@@ -5582,37 +6650,37 @@
     </w:p>
     <w:p>
       <w:r>
-        <w:t>1. Review the synthetic KPI, incident, test and feedback dataset.</w:t>
-      </w:r>
-    </w:p>
-    <w:p>
-      <w:r>
-        <w:t>2. Validate denominator, target and trend for each metric.</w:t>
-      </w:r>
-    </w:p>
-    <w:p>
-      <w:r>
-        <w:t>3. Ask Copilot to summarise evidence but require cell references.</w:t>
-      </w:r>
-    </w:p>
-    <w:p>
-      <w:r>
-        <w:t>4. Identify control failures, unintended outcomes and data gaps.</w:t>
-      </w:r>
-    </w:p>
-    <w:p>
-      <w:r>
-        <w:t>5. Classify each agent as scale, remediate, pause or retire.</w:t>
-      </w:r>
-    </w:p>
-    <w:p>
-      <w:r>
-        <w:t>6. Respond to the prompt-injection incident using the provided playbook.</w:t>
-      </w:r>
-    </w:p>
-    <w:p>
-      <w:r>
-        <w:t>7. Create a 90-day roadmap with decision gates and accountable owners.</w:t>
+        <w:t>1. Map every activity from talent need to offboarding and identify hand-offs between Copilot, agents, flows and humans.</w:t>
+      </w:r>
+    </w:p>
+    <w:p>
+      <w:r>
+        <w:t>2. Review the synthetic cycle-time, quality, adoption, escalation, incident and feedback evidence.</w:t>
+      </w:r>
+    </w:p>
+    <w:p>
+      <w:r>
+        <w:t>3. Validate denominator, baseline, target and trend for each metric.</w:t>
+      </w:r>
+    </w:p>
+    <w:p>
+      <w:r>
+        <w:t>4. Ask Copilot to summarise evidence with cell references and explicit limitations.</w:t>
+      </w:r>
+    </w:p>
+    <w:p>
+      <w:r>
+        <w:t>5. Identify control failures, unintended outcomes, administrative work returned and new operating work created.</w:t>
+      </w:r>
+    </w:p>
+    <w:p>
+      <w:r>
+        <w:t>6. Classify each solution as scale, remediate, pause or retire and respond to the supplied incident.</w:t>
+      </w:r>
+    </w:p>
+    <w:p>
+      <w:r>
+        <w:t>7. Create a 90-day roadmap with decision gates, accountable owners and retirement paths.</w:t>
       </w:r>
     </w:p>
     <w:p>
@@ -5630,7 +6698,7 @@
     </w:p>
     <w:p>
       <w:r>
-        <w:t>You are supporting the Agentic AI for HR case. Use only the supplied synthetic evidence. Task: Use service, risk, adoption and human-value evidence to make a defensible operating decision. State assumptions, cite the evidence used, distinguish observation from inference, identify uncertainty, and list the human checks required before use.</w:t>
+        <w:t>You are supporting the Agentic AI for HR case. Use only the supplied synthetic evidence. Task: Use lifecycle, service, risk, adoption and human-value evidence to govern the full HR AI operating system. State assumptions, cite the evidence used, distinguish observation from inference, identify uncertainty, and list the human checks required before use.</w:t>
       </w:r>
     </w:p>
     <w:p>
@@ -5646,15 +6714,15 @@
         <w:pStyle w:val="ListBullet"/>
       </w:pPr>
       <w:r>
-        <w:t>Agent scorecard</w:t>
-      </w:r>
-    </w:p>
-    <w:p>
-      <w:pPr>
-        <w:pStyle w:val="ListBullet"/>
-      </w:pPr>
-      <w:r>
-        <w:t>Incident response</w:t>
+        <w:t>End-to-end HR AI service map</w:t>
+      </w:r>
+    </w:p>
+    <w:p>
+      <w:pPr>
+        <w:pStyle w:val="ListBullet"/>
+      </w:pPr>
+      <w:r>
+        <w:t>Agent scorecard and incident response</w:t>
       </w:r>
     </w:p>
     <w:p>
@@ -5820,7 +6888,7 @@
       <w:jc w:val="center"/>
     </w:pPr>
     <w:r>
-      <w:t xml:space="preserve">Learner Guide • Version 6.0 • </w:t>
+      <w:t xml:space="preserve">Learner Guide • Version 6.2 • </w:t>
     </w:r>
     <w:fldSimple w:instr="PAGE"/>
   </w:p>

</xml_diff>